<commit_message>
Redesign KP leaflet: yellow Forus style, clear pricing, stable layout
Less black, more yellow shapes and callouts; no repeated blocks;
pricing tells one story (pay cabinets only, gift setup hours);
fix PDF/DOCX alignment and manager block.

Co-authored-by: slitasov <slitasov@users.noreply.github.com>
</commit_message>
<xml_diff>
--- a/output/КП_ТФМ_Спецтехника_КЭДО_750.docx
+++ b/output/КП_ТФМ_Спецтехника_КЭДО_750.docx
@@ -20,7 +20,7 @@
             <w:r>
               <w:drawing>
                 <wp:inline xmlns:a="http://schemas.openxmlformats.org/drawingml/2006/main" xmlns:pic="http://schemas.openxmlformats.org/drawingml/2006/picture">
-                  <wp:extent cx="1296000" cy="562120"/>
+                  <wp:extent cx="1224000" cy="530892"/>
                   <wp:docPr id="1" name="Picture 1"/>
                   <wp:cNvGraphicFramePr>
                     <a:graphicFrameLocks noChangeAspect="1"/>
@@ -41,7 +41,7 @@
                         <pic:spPr>
                           <a:xfrm>
                             <a:off x="0" y="0"/>
-                            <a:ext cx="1296000" cy="562120"/>
+                            <a:ext cx="1224000" cy="530892"/>
                           </a:xfrm>
                           <a:prstGeom prst="rect"/>
                         </pic:spPr>
@@ -66,7 +66,7 @@
               <w:rPr>
                 <w:rFonts w:ascii="Arial" w:hAnsi="Arial" w:eastAsia="Arial"/>
                 <w:b/>
-                <w:color w:val="1A1A1A"/>
+                <w:color w:val="666666"/>
                 <w:sz w:val="16"/>
               </w:rPr>
               <w:t>Группа компаний «Форус»</w:t>
@@ -81,22 +81,7 @@
               <w:rPr>
                 <w:rFonts w:ascii="Arial" w:hAnsi="Arial" w:eastAsia="Arial"/>
                 <w:b w:val="0"/>
-                <w:color w:val="5A5A5A"/>
-                <w:sz w:val="16"/>
-              </w:rPr>
-              <w:t>Центр компетенции по кадровому электронному документообороту</w:t>
-            </w:r>
-          </w:p>
-          <w:p>
-            <w:pPr>
-              <w:spacing w:after="0"/>
-              <w:jc w:val="right"/>
-            </w:pPr>
-            <w:r>
-              <w:rPr>
-                <w:rFonts w:ascii="Arial" w:hAnsi="Arial" w:eastAsia="Arial"/>
-                <w:b w:val="0"/>
-                <w:color w:val="5A5A5A"/>
+                <w:color w:val="666666"/>
                 <w:sz w:val="16"/>
               </w:rPr>
               <w:t>+7 (3952) 78-00-00  ·  www.forus.ru</w:t>
@@ -107,10 +92,10 @@
     </w:tbl>
     <w:p>
       <w:pPr>
+        <w:spacing w:after="200"/>
         <w:pBdr>
-          <w:bottom w:val="single" w:sz="18" w:space="2" w:color="F0C14A"/>
+          <w:bottom w:val="single" w:sz="24" w:space="1" w:color="F0C14A"/>
         </w:pBdr>
-        <w:spacing w:after="160"/>
       </w:pPr>
     </w:p>
     <w:p>
@@ -122,8 +107,8 @@
         <w:rPr>
           <w:rFonts w:ascii="Arial" w:hAnsi="Arial" w:eastAsia="Arial"/>
           <w:b/>
-          <w:color w:val="1A1A1A"/>
-          <w:sz w:val="36"/>
+          <w:color w:val="2B2B2B"/>
+          <w:sz w:val="40"/>
         </w:rPr>
         <w:t>1С:Кабинет сотрудника</w:t>
       </w:r>
@@ -137,10 +122,10 @@
         <w:rPr>
           <w:rFonts w:ascii="Arial" w:hAnsi="Arial" w:eastAsia="Arial"/>
           <w:b w:val="0"/>
-          <w:color w:val="5A5A5A"/>
+          <w:color w:val="666666"/>
           <w:sz w:val="22"/>
         </w:rPr>
-        <w:t>Коммерческое предложение</w:t>
+        <w:t>Коммерческое предложение  ·  750 личных кабинетов</w:t>
       </w:r>
     </w:p>
     <w:p>
@@ -152,377 +137,10 @@
         <w:rPr>
           <w:rFonts w:ascii="Arial" w:hAnsi="Arial" w:eastAsia="Arial"/>
           <w:b/>
-          <w:color w:val="1A1A1A"/>
+          <w:color w:val="9A7A10"/>
           <w:sz w:val="20"/>
         </w:rPr>
-        <w:t>Автоматизируйте рутину — экономьте до 70% времени и сократите траты на расходники</w:t>
-      </w:r>
-    </w:p>
-    <w:p>
-      <w:pPr>
-        <w:spacing w:after="80" w:before="0"/>
-        <w:pBdr>
-          <w:bottom w:val="single" w:sz="18" w:space="2" w:color="F0C14A"/>
-        </w:pBdr>
-      </w:pPr>
-      <w:r>
-        <w:rPr>
-          <w:rFonts w:ascii="Arial" w:hAnsi="Arial" w:eastAsia="Arial"/>
-          <w:b/>
-          <w:color w:val="1A1A1A"/>
-          <w:sz w:val="24"/>
-        </w:rPr>
-        <w:t>Почему компании переходят на кадровый электронный документооборот</w:t>
-      </w:r>
-    </w:p>
-    <w:p>
-      <w:pPr>
-        <w:spacing w:after="60" w:before="0"/>
-      </w:pPr>
-      <w:r>
-        <w:rPr>
-          <w:rFonts w:ascii="Arial" w:hAnsi="Arial" w:eastAsia="Arial"/>
-          <w:b/>
-          <w:color w:val="F0C14A"/>
-          <w:sz w:val="20"/>
-        </w:rPr>
-        <w:t xml:space="preserve">✓  </w:t>
-      </w:r>
-      <w:r>
-        <w:rPr>
-          <w:rFonts w:ascii="Arial" w:hAnsi="Arial" w:eastAsia="Arial"/>
-          <w:b w:val="0"/>
-          <w:color w:val="1A1A1A"/>
-          <w:sz w:val="20"/>
-        </w:rPr>
-        <w:t>Согласования занимают минуты, а не дни.</w:t>
-      </w:r>
-    </w:p>
-    <w:p>
-      <w:pPr>
-        <w:spacing w:after="60" w:before="0"/>
-      </w:pPr>
-      <w:r>
-        <w:rPr>
-          <w:rFonts w:ascii="Arial" w:hAnsi="Arial" w:eastAsia="Arial"/>
-          <w:b/>
-          <w:color w:val="F0C14A"/>
-          <w:sz w:val="20"/>
-        </w:rPr>
-        <w:t xml:space="preserve">✓  </w:t>
-      </w:r>
-      <w:r>
-        <w:rPr>
-          <w:rFonts w:ascii="Arial" w:hAnsi="Arial" w:eastAsia="Arial"/>
-          <w:b w:val="0"/>
-          <w:color w:val="1A1A1A"/>
-          <w:sz w:val="20"/>
-        </w:rPr>
-        <w:t>Меньше бумаги, печати, курьеров и риска потерять оригинал.</w:t>
-      </w:r>
-    </w:p>
-    <w:p>
-      <w:pPr>
-        <w:spacing w:after="60" w:before="0"/>
-      </w:pPr>
-      <w:r>
-        <w:rPr>
-          <w:rFonts w:ascii="Arial" w:hAnsi="Arial" w:eastAsia="Arial"/>
-          <w:b/>
-          <w:color w:val="F0C14A"/>
-          <w:sz w:val="20"/>
-        </w:rPr>
-        <w:t xml:space="preserve">✓  </w:t>
-      </w:r>
-      <w:r>
-        <w:rPr>
-          <w:rFonts w:ascii="Arial" w:hAnsi="Arial" w:eastAsia="Arial"/>
-          <w:b w:val="0"/>
-          <w:color w:val="1A1A1A"/>
-          <w:sz w:val="20"/>
-        </w:rPr>
-        <w:t>Удалённые сотрудники подписывают документы без поездок в офис.</w:t>
-      </w:r>
-    </w:p>
-    <w:p>
-      <w:pPr>
-        <w:spacing w:after="60" w:before="0"/>
-      </w:pPr>
-      <w:r>
-        <w:rPr>
-          <w:rFonts w:ascii="Arial" w:hAnsi="Arial" w:eastAsia="Arial"/>
-          <w:b/>
-          <w:color w:val="F0C14A"/>
-          <w:sz w:val="20"/>
-        </w:rPr>
-        <w:t xml:space="preserve">✓  </w:t>
-      </w:r>
-      <w:r>
-        <w:rPr>
-          <w:rFonts w:ascii="Arial" w:hAnsi="Arial" w:eastAsia="Arial"/>
-          <w:b w:val="0"/>
-          <w:color w:val="1A1A1A"/>
-          <w:sz w:val="20"/>
-        </w:rPr>
-        <w:t>Кадровики и бухгалтерия тратят меньше времени на рутину.</w:t>
-      </w:r>
-    </w:p>
-    <w:p>
-      <w:pPr>
-        <w:spacing w:after="80" w:before="0"/>
-        <w:pBdr>
-          <w:bottom w:val="single" w:sz="18" w:space="2" w:color="F0C14A"/>
-        </w:pBdr>
-      </w:pPr>
-      <w:r>
-        <w:rPr>
-          <w:rFonts w:ascii="Arial" w:hAnsi="Arial" w:eastAsia="Arial"/>
-          <w:b/>
-          <w:color w:val="1A1A1A"/>
-          <w:sz w:val="24"/>
-        </w:rPr>
-        <w:t>Что умеет сервис</w:t>
-      </w:r>
-    </w:p>
-    <w:p>
-      <w:pPr>
-        <w:spacing w:after="20" w:before="0"/>
-      </w:pPr>
-      <w:r>
-        <w:rPr>
-          <w:rFonts w:ascii="Arial" w:hAnsi="Arial" w:eastAsia="Arial"/>
-          <w:b/>
-          <w:color w:val="1A1A1A"/>
-          <w:sz w:val="20"/>
-        </w:rPr>
-        <w:t>Удобная работа с «неуловимыми» сотрудниками</w:t>
-      </w:r>
-    </w:p>
-    <w:p>
-      <w:pPr>
-        <w:spacing w:after="120" w:before="0"/>
-      </w:pPr>
-      <w:r>
-        <w:rPr>
-          <w:rFonts w:ascii="Arial" w:hAnsi="Arial" w:eastAsia="Arial"/>
-          <w:b w:val="0"/>
-          <w:color w:val="5A5A5A"/>
-          <w:sz w:val="18"/>
-        </w:rPr>
-        <w:t>Расчётные листки, справки и запросы по отпускам доступны удалённо каждому сотруднику в личном кабинете.</w:t>
-      </w:r>
-    </w:p>
-    <w:p>
-      <w:pPr>
-        <w:spacing w:after="20" w:before="0"/>
-      </w:pPr>
-      <w:r>
-        <w:rPr>
-          <w:rFonts w:ascii="Arial" w:hAnsi="Arial" w:eastAsia="Arial"/>
-          <w:b/>
-          <w:color w:val="1A1A1A"/>
-          <w:sz w:val="20"/>
-        </w:rPr>
-        <w:t>Ознакомление с документами в один клик</w:t>
-      </w:r>
-    </w:p>
-    <w:p>
-      <w:pPr>
-        <w:spacing w:after="120" w:before="0"/>
-      </w:pPr>
-      <w:r>
-        <w:rPr>
-          <w:rFonts w:ascii="Arial" w:hAnsi="Arial" w:eastAsia="Arial"/>
-          <w:b w:val="0"/>
-          <w:color w:val="5A5A5A"/>
-          <w:sz w:val="18"/>
-        </w:rPr>
-        <w:t>Не нужно распечатывать, собирать подписи и хранить горы бумаг. Отправили документ — сотрудник ознакомился и подтвердил получение.</w:t>
-      </w:r>
-    </w:p>
-    <w:p>
-      <w:pPr>
-        <w:spacing w:after="20" w:before="0"/>
-      </w:pPr>
-      <w:r>
-        <w:rPr>
-          <w:rFonts w:ascii="Arial" w:hAnsi="Arial" w:eastAsia="Arial"/>
-          <w:b/>
-          <w:color w:val="1A1A1A"/>
-          <w:sz w:val="20"/>
-        </w:rPr>
-        <w:t>Удалённый приём на работу</w:t>
-      </w:r>
-    </w:p>
-    <w:p>
-      <w:pPr>
-        <w:spacing w:after="120" w:before="0"/>
-      </w:pPr>
-      <w:r>
-        <w:rPr>
-          <w:rFonts w:ascii="Arial" w:hAnsi="Arial" w:eastAsia="Arial"/>
-          <w:b w:val="0"/>
-          <w:color w:val="5A5A5A"/>
-          <w:sz w:val="18"/>
-        </w:rPr>
-        <w:t>Новый сотрудник оформляет трудовой договор, заявление и ознакомление с правилами дистанционно.</w:t>
-      </w:r>
-    </w:p>
-    <w:p>
-      <w:pPr>
-        <w:spacing w:after="20" w:before="0"/>
-      </w:pPr>
-      <w:r>
-        <w:rPr>
-          <w:rFonts w:ascii="Arial" w:hAnsi="Arial" w:eastAsia="Arial"/>
-          <w:b/>
-          <w:color w:val="1A1A1A"/>
-          <w:sz w:val="20"/>
-        </w:rPr>
-        <w:t>Меньше ручного ввода и ошибок</w:t>
-      </w:r>
-    </w:p>
-    <w:p>
-      <w:pPr>
-        <w:spacing w:after="120" w:before="0"/>
-      </w:pPr>
-      <w:r>
-        <w:rPr>
-          <w:rFonts w:ascii="Arial" w:hAnsi="Arial" w:eastAsia="Arial"/>
-          <w:b w:val="0"/>
-          <w:color w:val="5A5A5A"/>
-          <w:sz w:val="18"/>
-        </w:rPr>
-        <w:t>Данные от сотрудников автоматически попадают в 1С. Заявления превращаются в готовые приказы и записи.</w:t>
-      </w:r>
-    </w:p>
-    <w:p>
-      <w:pPr>
-        <w:spacing w:after="20" w:before="0"/>
-      </w:pPr>
-      <w:r>
-        <w:rPr>
-          <w:rFonts w:ascii="Arial" w:hAnsi="Arial" w:eastAsia="Arial"/>
-          <w:b/>
-          <w:color w:val="1A1A1A"/>
-          <w:sz w:val="20"/>
-        </w:rPr>
-        <w:t>Согласование без походов по кабинетам</w:t>
-      </w:r>
-    </w:p>
-    <w:p>
-      <w:pPr>
-        <w:spacing w:after="120" w:before="0"/>
-      </w:pPr>
-      <w:r>
-        <w:rPr>
-          <w:rFonts w:ascii="Arial" w:hAnsi="Arial" w:eastAsia="Arial"/>
-          <w:b w:val="0"/>
-          <w:color w:val="5A5A5A"/>
-          <w:sz w:val="18"/>
-        </w:rPr>
-        <w:t>Отпуск, командировка, отгул — руководитель согласовывает с телефона, данные сразу уходят в 1С.</w:t>
-      </w:r>
-    </w:p>
-    <w:p>
-      <w:pPr>
-        <w:spacing w:after="20" w:before="0"/>
-      </w:pPr>
-      <w:r>
-        <w:rPr>
-          <w:rFonts w:ascii="Arial" w:hAnsi="Arial" w:eastAsia="Arial"/>
-          <w:b/>
-          <w:color w:val="1A1A1A"/>
-          <w:sz w:val="20"/>
-        </w:rPr>
-        <w:t>Общение без сторонних мессенджеров</w:t>
-      </w:r>
-    </w:p>
-    <w:p>
-      <w:pPr>
-        <w:spacing w:after="120" w:before="0"/>
-      </w:pPr>
-      <w:r>
-        <w:rPr>
-          <w:rFonts w:ascii="Arial" w:hAnsi="Arial" w:eastAsia="Arial"/>
-          <w:b w:val="0"/>
-          <w:color w:val="5A5A5A"/>
-          <w:sz w:val="18"/>
-        </w:rPr>
-        <w:t>Рабочие вопросы и документы — внутри системы, с соблюдением требований закона о персональных данных.</w:t>
-      </w:r>
-    </w:p>
-    <w:p>
-      <w:pPr>
-        <w:spacing w:after="20" w:before="0"/>
-      </w:pPr>
-      <w:r>
-        <w:rPr>
-          <w:rFonts w:ascii="Arial" w:hAnsi="Arial" w:eastAsia="Arial"/>
-          <w:b/>
-          <w:color w:val="1A1A1A"/>
-          <w:sz w:val="20"/>
-        </w:rPr>
-        <w:t>Электронный архив и защита от штрафов</w:t>
-      </w:r>
-    </w:p>
-    <w:p>
-      <w:pPr>
-        <w:spacing w:after="120" w:before="0"/>
-      </w:pPr>
-      <w:r>
-        <w:rPr>
-          <w:rFonts w:ascii="Arial" w:hAnsi="Arial" w:eastAsia="Arial"/>
-          <w:b w:val="0"/>
-          <w:color w:val="5A5A5A"/>
-          <w:sz w:val="18"/>
-        </w:rPr>
-        <w:t>Кадровые документы хранятся в электронном виде. Есть подтверждение получения расчётного листка и ознакомления с приказом.</w:t>
-      </w:r>
-    </w:p>
-    <w:p>
-      <w:pPr>
-        <w:spacing w:after="20" w:before="0"/>
-      </w:pPr>
-      <w:r>
-        <w:rPr>
-          <w:rFonts w:ascii="Arial" w:hAnsi="Arial" w:eastAsia="Arial"/>
-          <w:b/>
-          <w:color w:val="1A1A1A"/>
-          <w:sz w:val="20"/>
-        </w:rPr>
-        <w:t>Простое внедрение для ИТ-отдела</w:t>
-      </w:r>
-    </w:p>
-    <w:p>
-      <w:pPr>
-        <w:spacing w:after="120" w:before="0"/>
-      </w:pPr>
-      <w:r>
-        <w:rPr>
-          <w:rFonts w:ascii="Arial" w:hAnsi="Arial" w:eastAsia="Arial"/>
-          <w:b w:val="0"/>
-          <w:color w:val="5A5A5A"/>
-          <w:sz w:val="18"/>
-        </w:rPr>
-        <w:t>Сервис встроен в 1С: не нужна отдельная кадровая платформа, новые клиентские лицензии 1С и сложная интеграция.</w:t>
-      </w:r>
-    </w:p>
-    <w:p>
-      <w:pPr>
-        <w:spacing w:after="80" w:before="0"/>
-        <w:pBdr>
-          <w:bottom w:val="single" w:sz="18" w:space="2" w:color="F0C14A"/>
-        </w:pBdr>
-      </w:pPr>
-      <w:r>
-        <w:rPr>
-          <w:rFonts w:ascii="Arial" w:hAnsi="Arial" w:eastAsia="Arial"/>
-          <w:b/>
-          <w:color w:val="1A1A1A"/>
-          <w:sz w:val="24"/>
-        </w:rPr>
-        <w:t>Акция «Больше, чем кешбэк!»</w:t>
+        <w:t>Самое простое внедрение  ·  без отдельной платформы</w:t>
       </w:r>
     </w:p>
     <w:tbl>
@@ -530,12 +148,12 @@
         <w:tblW w:type="auto" w:w="0"/>
         <w:tblLook w:firstColumn="1" w:firstRow="1" w:lastColumn="0" w:lastRow="0" w:noHBand="0" w:noVBand="1" w:val="04A0"/>
         <w:tblBorders>
-          <w:top w:val="single" w:sz="4" w:space="0" w:color="F0C14A"/>
-          <w:left w:val="single" w:sz="4" w:space="0" w:color="F0C14A"/>
-          <w:bottom w:val="single" w:sz="4" w:space="0" w:color="F0C14A"/>
-          <w:right w:val="single" w:sz="4" w:space="0" w:color="F0C14A"/>
-          <w:insideH w:val="single" w:sz="4" w:space="0" w:color="F0C14A"/>
-          <w:insideV w:val="single" w:sz="4" w:space="0" w:color="F0C14A"/>
+          <w:top w:val="single" w:sz="12" w:space="0" w:color="F0C14A"/>
+          <w:left w:val="single" w:sz="12" w:space="0" w:color="F0C14A"/>
+          <w:bottom w:val="single" w:sz="12" w:space="0" w:color="F0C14A"/>
+          <w:right w:val="single" w:sz="12" w:space="0" w:color="F0C14A"/>
+          <w:insideH w:val="single" w:sz="12" w:space="0" w:color="F0C14A"/>
+          <w:insideV w:val="single" w:sz="12" w:space="0" w:color="F0C14A"/>
         </w:tblBorders>
       </w:tblPr>
       <w:tblGrid>
@@ -545,17 +163,17 @@
         <w:tc>
           <w:tcPr>
             <w:tcW w:type="dxa" w:w="10318"/>
-            <w:shd w:fill="1A1A1A" w:val="clear"/>
+            <w:shd w:fill="FFF6D8" w:val="clear"/>
           </w:tcPr>
           <w:p>
             <w:r>
               <w:rPr>
                 <w:rFonts w:ascii="Arial" w:hAnsi="Arial" w:eastAsia="Arial"/>
                 <w:b/>
-                <w:color w:val="F0C14A"/>
+                <w:color w:val="2B2B2B"/>
                 <w:sz w:val="22"/>
               </w:rPr>
-              <w:t>5 часов линии консультаций — в подарок</w:t>
+              <w:t>Выгода, которую сразу видно</w:t>
             </w:r>
           </w:p>
           <w:p>
@@ -563,10 +181,67 @@
               <w:rPr>
                 <w:rFonts w:ascii="Arial" w:hAnsi="Arial" w:eastAsia="Arial"/>
                 <w:b w:val="0"/>
-                <w:color w:val="FFFFFF"/>
+                <w:color w:val="666666"/>
                 <w:sz w:val="18"/>
               </w:rPr>
-              <w:t>При оплате пакета личных кабинетов мы начисляем 5 часов линии консультаций бесплатно (выгода 18 300 ₽).</w:t>
+              <w:t>Вы платите только за личные кабинеты. Настройка и поддержка на старте — в подарок. Сервис уже внутри 1С: не нужно покупать и внедрять отдельную кадровую систему.</w:t>
+            </w:r>
+          </w:p>
+        </w:tc>
+      </w:tr>
+    </w:tbl>
+    <w:p>
+      <w:pPr>
+        <w:spacing w:after="160"/>
+      </w:pPr>
+    </w:p>
+    <w:p>
+      <w:pPr>
+        <w:spacing w:after="40" w:before="0"/>
+        <w:pBdr>
+          <w:bottom w:val="single" w:sz="20" w:space="2" w:color="F0C14A"/>
+        </w:pBdr>
+      </w:pPr>
+      <w:r>
+        <w:rPr>
+          <w:rFonts w:ascii="Arial" w:hAnsi="Arial" w:eastAsia="Arial"/>
+          <w:b/>
+          <w:color w:val="2B2B2B"/>
+          <w:sz w:val="26"/>
+        </w:rPr>
+        <w:t>Что меняется в работе</w:t>
+      </w:r>
+    </w:p>
+    <w:tbl>
+      <w:tblPr>
+        <w:tblW w:type="auto" w:w="0"/>
+        <w:tblLook w:firstColumn="1" w:firstRow="1" w:lastColumn="0" w:lastRow="0" w:noHBand="0" w:noVBand="1" w:val="04A0"/>
+        <w:tblBorders>
+          <w:top w:val="single" w:sz="6" w:space="0" w:color="FFE08A"/>
+          <w:left w:val="single" w:sz="6" w:space="0" w:color="FFE08A"/>
+          <w:bottom w:val="single" w:sz="6" w:space="0" w:color="FFE08A"/>
+          <w:right w:val="single" w:sz="6" w:space="0" w:color="FFE08A"/>
+          <w:insideH w:val="single" w:sz="6" w:space="0" w:color="FFE08A"/>
+          <w:insideV w:val="single" w:sz="6" w:space="0" w:color="FFE08A"/>
+        </w:tblBorders>
+      </w:tblPr>
+      <w:tblGrid>
+        <w:gridCol w:w="10318"/>
+      </w:tblGrid>
+      <w:tr>
+        <w:tc>
+          <w:tcPr>
+            <w:tcW w:type="dxa" w:w="10318"/>
+            <w:shd w:fill="FFFBEA" w:val="clear"/>
+          </w:tcPr>
+          <w:p>
+            <w:r>
+              <w:rPr>
+                <w:rFonts w:ascii="Arial" w:hAnsi="Arial" w:eastAsia="Arial"/>
+                <w:b/>
+                <w:sz w:val="20"/>
+              </w:rPr>
+              <w:t>Расчётные листки и справки — в телефоне</w:t>
             </w:r>
           </w:p>
           <w:p>
@@ -574,10 +249,50 @@
               <w:rPr>
                 <w:rFonts w:ascii="Arial" w:hAnsi="Arial" w:eastAsia="Arial"/>
                 <w:b w:val="0"/>
-                <w:color w:val="FFFFFF"/>
+                <w:color w:val="666666"/>
                 <w:sz w:val="18"/>
               </w:rPr>
-              <w:t>Из них в среднем 4 часа уходят на настройку и запуск сервиса.</w:t>
+              <w:t>Сотрудник сам открывает документы в личном кабинете. Меньше очередей у кадровика.</w:t>
+            </w:r>
+          </w:p>
+        </w:tc>
+      </w:tr>
+    </w:tbl>
+    <w:p>
+      <w:pPr>
+        <w:spacing w:after="80"/>
+      </w:pPr>
+    </w:p>
+    <w:tbl>
+      <w:tblPr>
+        <w:tblW w:type="auto" w:w="0"/>
+        <w:tblLook w:firstColumn="1" w:firstRow="1" w:lastColumn="0" w:lastRow="0" w:noHBand="0" w:noVBand="1" w:val="04A0"/>
+        <w:tblBorders>
+          <w:top w:val="single" w:sz="6" w:space="0" w:color="FFE08A"/>
+          <w:left w:val="single" w:sz="6" w:space="0" w:color="FFE08A"/>
+          <w:bottom w:val="single" w:sz="6" w:space="0" w:color="FFE08A"/>
+          <w:right w:val="single" w:sz="6" w:space="0" w:color="FFE08A"/>
+          <w:insideH w:val="single" w:sz="6" w:space="0" w:color="FFE08A"/>
+          <w:insideV w:val="single" w:sz="6" w:space="0" w:color="FFE08A"/>
+        </w:tblBorders>
+      </w:tblPr>
+      <w:tblGrid>
+        <w:gridCol w:w="10318"/>
+      </w:tblGrid>
+      <w:tr>
+        <w:tc>
+          <w:tcPr>
+            <w:tcW w:type="dxa" w:w="10318"/>
+            <w:shd w:fill="FFFBEA" w:val="clear"/>
+          </w:tcPr>
+          <w:p>
+            <w:r>
+              <w:rPr>
+                <w:rFonts w:ascii="Arial" w:hAnsi="Arial" w:eastAsia="Arial"/>
+                <w:b/>
+                <w:sz w:val="20"/>
+              </w:rPr>
+              <w:t>Заявления и согласования online</w:t>
             </w:r>
           </w:p>
           <w:p>
@@ -585,10 +300,50 @@
               <w:rPr>
                 <w:rFonts w:ascii="Arial" w:hAnsi="Arial" w:eastAsia="Arial"/>
                 <w:b w:val="0"/>
-                <w:color w:val="FFFFFF"/>
+                <w:color w:val="666666"/>
                 <w:sz w:val="18"/>
               </w:rPr>
-              <w:t>Ещё 1 час остаётся у вас на вопросы, консультации и решение возникающих задач по 1С с нашими специалистами.</w:t>
+              <w:t>Отпуск, отгул, командировка: сотрудник подал — руководитель утвердил с телефона — данные в 1С.</w:t>
+            </w:r>
+          </w:p>
+        </w:tc>
+      </w:tr>
+    </w:tbl>
+    <w:p>
+      <w:pPr>
+        <w:spacing w:after="80"/>
+      </w:pPr>
+    </w:p>
+    <w:tbl>
+      <w:tblPr>
+        <w:tblW w:type="auto" w:w="0"/>
+        <w:tblLook w:firstColumn="1" w:firstRow="1" w:lastColumn="0" w:lastRow="0" w:noHBand="0" w:noVBand="1" w:val="04A0"/>
+        <w:tblBorders>
+          <w:top w:val="single" w:sz="6" w:space="0" w:color="FFE08A"/>
+          <w:left w:val="single" w:sz="6" w:space="0" w:color="FFE08A"/>
+          <w:bottom w:val="single" w:sz="6" w:space="0" w:color="FFE08A"/>
+          <w:right w:val="single" w:sz="6" w:space="0" w:color="FFE08A"/>
+          <w:insideH w:val="single" w:sz="6" w:space="0" w:color="FFE08A"/>
+          <w:insideV w:val="single" w:sz="6" w:space="0" w:color="FFE08A"/>
+        </w:tblBorders>
+      </w:tblPr>
+      <w:tblGrid>
+        <w:gridCol w:w="10318"/>
+      </w:tblGrid>
+      <w:tr>
+        <w:tc>
+          <w:tcPr>
+            <w:tcW w:type="dxa" w:w="10318"/>
+            <w:shd w:fill="FFFBEA" w:val="clear"/>
+          </w:tcPr>
+          <w:p>
+            <w:r>
+              <w:rPr>
+                <w:rFonts w:ascii="Arial" w:hAnsi="Arial" w:eastAsia="Arial"/>
+                <w:b/>
+                <w:sz w:val="20"/>
+              </w:rPr>
+              <w:t>Удалённый приём без визита в офис</w:t>
             </w:r>
           </w:p>
           <w:p>
@@ -596,10 +351,10 @@
               <w:rPr>
                 <w:rFonts w:ascii="Arial" w:hAnsi="Arial" w:eastAsia="Arial"/>
                 <w:b w:val="0"/>
-                <w:color w:val="FFFFFF"/>
+                <w:color w:val="666666"/>
                 <w:sz w:val="18"/>
               </w:rPr>
-              <w:t>Отдельно за часы линии консультаций платить не нужно — они полностью покрываются подарком.</w:t>
+              <w:t>Трудовой договор и ознакомление с правилами подписываются дистанционно.</w:t>
             </w:r>
           </w:p>
         </w:tc>
@@ -607,33 +362,126 @@
     </w:tbl>
     <w:p>
       <w:pPr>
-        <w:spacing w:after="80" w:before="0"/>
+        <w:spacing w:after="80"/>
+      </w:pPr>
+    </w:p>
+    <w:tbl>
+      <w:tblPr>
+        <w:tblW w:type="auto" w:w="0"/>
+        <w:tblLook w:firstColumn="1" w:firstRow="1" w:lastColumn="0" w:lastRow="0" w:noHBand="0" w:noVBand="1" w:val="04A0"/>
+        <w:tblBorders>
+          <w:top w:val="single" w:sz="6" w:space="0" w:color="FFE08A"/>
+          <w:left w:val="single" w:sz="6" w:space="0" w:color="FFE08A"/>
+          <w:bottom w:val="single" w:sz="6" w:space="0" w:color="FFE08A"/>
+          <w:right w:val="single" w:sz="6" w:space="0" w:color="FFE08A"/>
+          <w:insideH w:val="single" w:sz="6" w:space="0" w:color="FFE08A"/>
+          <w:insideV w:val="single" w:sz="6" w:space="0" w:color="FFE08A"/>
+        </w:tblBorders>
+      </w:tblPr>
+      <w:tblGrid>
+        <w:gridCol w:w="10318"/>
+      </w:tblGrid>
+      <w:tr>
+        <w:tc>
+          <w:tcPr>
+            <w:tcW w:type="dxa" w:w="10318"/>
+            <w:shd w:fill="FFFBEA" w:val="clear"/>
+          </w:tcPr>
+          <w:p>
+            <w:r>
+              <w:rPr>
+                <w:rFonts w:ascii="Arial" w:hAnsi="Arial" w:eastAsia="Arial"/>
+                <w:b/>
+                <w:sz w:val="20"/>
+              </w:rPr>
+              <w:t>Документы без бумаги и мессенджеров</w:t>
+            </w:r>
+          </w:p>
+          <w:p>
+            <w:r>
+              <w:rPr>
+                <w:rFonts w:ascii="Arial" w:hAnsi="Arial" w:eastAsia="Arial"/>
+                <w:b w:val="0"/>
+                <w:color w:val="666666"/>
+                <w:sz w:val="18"/>
+              </w:rPr>
+              <w:t>Ознакомление в один клик, подтверждение получения, обмен внутри системы — по закону о персональных данных.</w:t>
+            </w:r>
+          </w:p>
+        </w:tc>
+      </w:tr>
+    </w:tbl>
+    <w:p>
+      <w:pPr>
+        <w:spacing w:after="80"/>
+      </w:pPr>
+    </w:p>
+    <w:tbl>
+      <w:tblPr>
+        <w:tblW w:type="auto" w:w="0"/>
+        <w:tblLook w:firstColumn="1" w:firstRow="1" w:lastColumn="0" w:lastRow="0" w:noHBand="0" w:noVBand="1" w:val="04A0"/>
+        <w:tblBorders>
+          <w:top w:val="single" w:sz="6" w:space="0" w:color="FFE08A"/>
+          <w:left w:val="single" w:sz="6" w:space="0" w:color="FFE08A"/>
+          <w:bottom w:val="single" w:sz="6" w:space="0" w:color="FFE08A"/>
+          <w:right w:val="single" w:sz="6" w:space="0" w:color="FFE08A"/>
+          <w:insideH w:val="single" w:sz="6" w:space="0" w:color="FFE08A"/>
+          <w:insideV w:val="single" w:sz="6" w:space="0" w:color="FFE08A"/>
+        </w:tblBorders>
+      </w:tblPr>
+      <w:tblGrid>
+        <w:gridCol w:w="10318"/>
+      </w:tblGrid>
+      <w:tr>
+        <w:tc>
+          <w:tcPr>
+            <w:tcW w:type="dxa" w:w="10318"/>
+            <w:shd w:fill="FFFBEA" w:val="clear"/>
+          </w:tcPr>
+          <w:p>
+            <w:r>
+              <w:rPr>
+                <w:rFonts w:ascii="Arial" w:hAnsi="Arial" w:eastAsia="Arial"/>
+                <w:b/>
+                <w:sz w:val="20"/>
+              </w:rPr>
+              <w:t>Кадровик остаётся в привычной 1С</w:t>
+            </w:r>
+          </w:p>
+          <w:p>
+            <w:r>
+              <w:rPr>
+                <w:rFonts w:ascii="Arial" w:hAnsi="Arial" w:eastAsia="Arial"/>
+                <w:b w:val="0"/>
+                <w:color w:val="666666"/>
+                <w:sz w:val="18"/>
+              </w:rPr>
+              <w:t>Заявления автоматически становятся приказами. Меньше ручного ввода и ошибок.</w:t>
+            </w:r>
+          </w:p>
+        </w:tc>
+      </w:tr>
+    </w:tbl>
+    <w:p>
+      <w:pPr>
+        <w:spacing w:after="80"/>
+      </w:pPr>
+    </w:p>
+    <w:p>
+      <w:pPr>
+        <w:spacing w:after="40" w:before="0"/>
         <w:pBdr>
-          <w:bottom w:val="single" w:sz="18" w:space="2" w:color="F0C14A"/>
+          <w:bottom w:val="single" w:sz="20" w:space="2" w:color="F0C14A"/>
         </w:pBdr>
       </w:pPr>
       <w:r>
         <w:rPr>
           <w:rFonts w:ascii="Arial" w:hAnsi="Arial" w:eastAsia="Arial"/>
           <w:b/>
-          <w:color w:val="1A1A1A"/>
-          <w:sz w:val="24"/>
+          <w:color w:val="2B2B2B"/>
+          <w:sz w:val="26"/>
         </w:rPr>
-        <w:t>Ваш пакет: 750 личных кабинетов на 12 месяцев</w:t>
-      </w:r>
-    </w:p>
-    <w:p>
-      <w:pPr>
-        <w:spacing w:after="120" w:before="0"/>
-      </w:pPr>
-      <w:r>
-        <w:rPr>
-          <w:rFonts w:ascii="Arial" w:hAnsi="Arial" w:eastAsia="Arial"/>
-          <w:b w:val="0"/>
-          <w:color w:val="5A5A5A"/>
-          <w:sz w:val="18"/>
-        </w:rPr>
-        <w:t>Состав лицензий: 500 + 200 + 50 кабинетов. Цена за сотрудника — около 25 ₽ в месяц.</w:t>
+        <w:t>Цена пакета</w:t>
       </w:r>
     </w:p>
     <w:tbl>
@@ -641,12 +489,123 @@
         <w:tblW w:type="auto" w:w="0"/>
         <w:tblLook w:firstColumn="1" w:firstRow="1" w:lastColumn="0" w:lastRow="0" w:noHBand="0" w:noVBand="1" w:val="04A0"/>
         <w:tblBorders>
-          <w:top w:val="single" w:sz="4" w:space="0" w:color="F0C14A"/>
-          <w:left w:val="single" w:sz="4" w:space="0" w:color="F0C14A"/>
-          <w:bottom w:val="single" w:sz="4" w:space="0" w:color="F0C14A"/>
-          <w:right w:val="single" w:sz="4" w:space="0" w:color="F0C14A"/>
-          <w:insideH w:val="single" w:sz="4" w:space="0" w:color="F0C14A"/>
-          <w:insideV w:val="single" w:sz="4" w:space="0" w:color="F0C14A"/>
+          <w:top w:val="single" w:sz="14" w:space="0" w:color="F0C14A"/>
+          <w:left w:val="single" w:sz="14" w:space="0" w:color="F0C14A"/>
+          <w:bottom w:val="single" w:sz="14" w:space="0" w:color="F0C14A"/>
+          <w:right w:val="single" w:sz="14" w:space="0" w:color="F0C14A"/>
+          <w:insideH w:val="single" w:sz="14" w:space="0" w:color="F0C14A"/>
+          <w:insideV w:val="single" w:sz="14" w:space="0" w:color="F0C14A"/>
+        </w:tblBorders>
+      </w:tblPr>
+      <w:tblGrid>
+        <w:gridCol w:w="10318"/>
+      </w:tblGrid>
+      <w:tr>
+        <w:tc>
+          <w:tcPr>
+            <w:tcW w:type="dxa" w:w="10318"/>
+            <w:shd w:fill="F0C14A" w:val="clear"/>
+          </w:tcPr>
+          <w:p>
+            <w:pPr>
+              <w:jc w:val="center"/>
+            </w:pPr>
+            <w:r>
+              <w:rPr>
+                <w:rFonts w:ascii="Arial" w:hAnsi="Arial" w:eastAsia="Arial"/>
+                <w:b/>
+                <w:sz w:val="44"/>
+              </w:rPr>
+              <w:t>223 200 ₽</w:t>
+            </w:r>
+          </w:p>
+        </w:tc>
+      </w:tr>
+      <w:tr>
+        <w:tc>
+          <w:tcPr>
+            <w:tcW w:type="dxa" w:w="10318"/>
+            <w:shd w:fill="FFFFFF" w:val="clear"/>
+          </w:tcPr>
+          <w:p>
+            <w:pPr>
+              <w:jc w:val="center"/>
+            </w:pPr>
+            <w:r>
+              <w:rPr>
+                <w:rFonts w:ascii="Arial" w:hAnsi="Arial" w:eastAsia="Arial"/>
+                <w:b w:val="0"/>
+                <w:color w:val="666666"/>
+                <w:sz w:val="20"/>
+              </w:rPr>
+              <w:t>за 750 кабинетов на 12 месяцев  ·  ≈ 25 ₽ в месяц за сотрудника</w:t>
+            </w:r>
+          </w:p>
+        </w:tc>
+      </w:tr>
+      <w:tr>
+        <w:tc>
+          <w:tcPr>
+            <w:tcW w:type="dxa" w:w="10318"/>
+            <w:shd w:fill="FFF6D8" w:val="clear"/>
+          </w:tcPr>
+          <w:p>
+            <w:pPr>
+              <w:jc w:val="center"/>
+            </w:pPr>
+            <w:r>
+              <w:rPr>
+                <w:rFonts w:ascii="Arial" w:hAnsi="Arial" w:eastAsia="Arial"/>
+                <w:b/>
+                <w:sz w:val="18"/>
+              </w:rPr>
+              <w:t>В подарок 5 часов поддержки (выгода 18 300 ₽): ≈4 часа — настройка и запуск, 1 час — вопросы по 1С. За часы вы не платите.</w:t>
+            </w:r>
+          </w:p>
+        </w:tc>
+      </w:tr>
+    </w:tbl>
+    <w:p>
+      <w:pPr>
+        <w:spacing w:after="160" w:before="0"/>
+      </w:pPr>
+      <w:r>
+        <w:rPr>
+          <w:rFonts w:ascii="Arial" w:hAnsi="Arial" w:eastAsia="Arial"/>
+          <w:b w:val="0"/>
+          <w:color w:val="2B2B2B"/>
+          <w:sz w:val="20"/>
+        </w:rPr>
+      </w:r>
+    </w:p>
+    <w:p>
+      <w:pPr>
+        <w:spacing w:after="40" w:before="0"/>
+        <w:pBdr>
+          <w:bottom w:val="single" w:sz="20" w:space="2" w:color="F0C14A"/>
+        </w:pBdr>
+      </w:pPr>
+      <w:r>
+        <w:rPr>
+          <w:rFonts w:ascii="Arial" w:hAnsi="Arial" w:eastAsia="Arial"/>
+          <w:b/>
+          <w:color w:val="2B2B2B"/>
+          <w:sz w:val="26"/>
+        </w:rPr>
+        <w:t>Почему это легче и выгоднее</w:t>
+      </w:r>
+    </w:p>
+    <w:tbl>
+      <w:tblPr>
+        <w:tblW w:type="auto" w:w="0"/>
+        <w:tblLook w:firstColumn="1" w:firstRow="1" w:lastColumn="0" w:lastRow="0" w:noHBand="0" w:noVBand="1" w:val="04A0"/>
+        <w:tblBorders>
+          <w:top w:val="single" w:sz="8" w:space="0" w:color="F0C14A"/>
+          <w:left w:val="single" w:sz="8" w:space="0" w:color="F0C14A"/>
+          <w:bottom w:val="single" w:sz="8" w:space="0" w:color="F0C14A"/>
+          <w:right w:val="single" w:sz="8" w:space="0" w:color="F0C14A"/>
+          <w:insideH w:val="single" w:sz="8" w:space="0" w:color="F0C14A"/>
+          <w:insideV w:val="single" w:sz="8" w:space="0" w:color="F0C14A"/>
         </w:tblBorders>
       </w:tblPr>
       <w:tblGrid>
@@ -656,8 +615,27 @@
       <w:tr>
         <w:tc>
           <w:tcPr>
+            <w:tcW w:type="dxa" w:w="850"/>
+            <w:shd w:fill="F0C14A" w:val="clear"/>
+          </w:tcPr>
+          <w:p>
+            <w:pPr>
+              <w:jc w:val="center"/>
+            </w:pPr>
+            <w:r>
+              <w:rPr>
+                <w:rFonts w:ascii="Arial" w:hAnsi="Arial" w:eastAsia="Arial"/>
+                <w:b/>
+                <w:sz w:val="28"/>
+              </w:rPr>
+              <w:t>01</w:t>
+            </w:r>
+          </w:p>
+        </w:tc>
+        <w:tc>
+          <w:tcPr>
             <w:tcW w:type="dxa" w:w="5159"/>
-            <w:shd w:fill="FFF8E8" w:val="clear"/>
+            <w:shd w:fill="FFFBEA" w:val="clear"/>
           </w:tcPr>
           <w:p>
             <w:r>
@@ -666,18 +644,54 @@
                 <w:b/>
                 <w:sz w:val="20"/>
               </w:rPr>
-              <w:t>1С:Кабинет сотрудника — 750 кабинетов / 12 месяцев</w:t>
+              <w:t>Без новой платформы</w:t>
+            </w:r>
+          </w:p>
+          <w:p>
+            <w:r>
+              <w:rPr>
+                <w:rFonts w:ascii="Arial" w:hAnsi="Arial" w:eastAsia="Arial"/>
+                <w:b w:val="0"/>
+                <w:color w:val="666666"/>
+                <w:sz w:val="18"/>
+              </w:rPr>
+              <w:t>Сотрудники и кадры работают через 1С и личный кабинет. ИТ-отделу не нужно поднимать отдельную систему.</w:t>
             </w:r>
           </w:p>
         </w:tc>
+      </w:tr>
+    </w:tbl>
+    <w:p>
+      <w:pPr>
+        <w:spacing w:after="80"/>
+      </w:pPr>
+    </w:p>
+    <w:tbl>
+      <w:tblPr>
+        <w:tblW w:type="auto" w:w="0"/>
+        <w:tblLook w:firstColumn="1" w:firstRow="1" w:lastColumn="0" w:lastRow="0" w:noHBand="0" w:noVBand="1" w:val="04A0"/>
+        <w:tblBorders>
+          <w:top w:val="single" w:sz="8" w:space="0" w:color="F0C14A"/>
+          <w:left w:val="single" w:sz="8" w:space="0" w:color="F0C14A"/>
+          <w:bottom w:val="single" w:sz="8" w:space="0" w:color="F0C14A"/>
+          <w:right w:val="single" w:sz="8" w:space="0" w:color="F0C14A"/>
+          <w:insideH w:val="single" w:sz="8" w:space="0" w:color="F0C14A"/>
+          <w:insideV w:val="single" w:sz="8" w:space="0" w:color="F0C14A"/>
+        </w:tblBorders>
+      </w:tblPr>
+      <w:tblGrid>
+        <w:gridCol w:w="5159"/>
+        <w:gridCol w:w="5159"/>
+      </w:tblGrid>
+      <w:tr>
         <w:tc>
           <w:tcPr>
-            <w:tcW w:type="dxa" w:w="5159"/>
-            <w:shd w:fill="FFF8E8" w:val="clear"/>
+            <w:tcW w:type="dxa" w:w="850"/>
+            <w:shd w:fill="F0C14A" w:val="clear"/>
           </w:tcPr>
           <w:p>
             <w:pPr>
-              <w:jc w:val="right"/>
+              <w:jc w:val="center"/>
             </w:pPr>
             <w:r>
               <w:rPr>
@@ -685,7 +699,34 @@
                 <w:b/>
                 <w:sz w:val="28"/>
               </w:rPr>
-              <w:t>223 200 ₽</w:t>
+              <w:t>02</w:t>
+            </w:r>
+          </w:p>
+        </w:tc>
+        <w:tc>
+          <w:tcPr>
+            <w:tcW w:type="dxa" w:w="5159"/>
+            <w:shd w:fill="FFFBEA" w:val="clear"/>
+          </w:tcPr>
+          <w:p>
+            <w:r>
+              <w:rPr>
+                <w:rFonts w:ascii="Arial" w:hAnsi="Arial" w:eastAsia="Arial"/>
+                <w:b/>
+                <w:sz w:val="20"/>
+              </w:rPr>
+              <w:t>Запуск за часы, не месяцы</w:t>
+            </w:r>
+          </w:p>
+          <w:p>
+            <w:r>
+              <w:rPr>
+                <w:rFonts w:ascii="Arial" w:hAnsi="Arial" w:eastAsia="Arial"/>
+                <w:b w:val="0"/>
+                <w:color w:val="666666"/>
+                <w:sz w:val="18"/>
+              </w:rPr>
+              <w:t>Типовая настройка — около одного рабочего дня. Пилот за 1–2 недели, все 750 кабинетов за 1–1,5 месяца.</w:t>
             </w:r>
           </w:p>
         </w:tc>
@@ -693,248 +734,95 @@
     </w:tbl>
     <w:p>
       <w:pPr>
-        <w:spacing w:after="200" w:before="0"/>
+        <w:spacing w:after="80"/>
       </w:pPr>
-      <w:r>
-        <w:rPr>
-          <w:rFonts w:ascii="Arial" w:hAnsi="Arial" w:eastAsia="Arial"/>
-          <w:b w:val="0"/>
-          <w:color w:val="5A5A5A"/>
-          <w:sz w:val="18"/>
-        </w:rPr>
-        <w:t>Настройка, запуск и час поддержки по вопросам 1С — бесплатно в рамках подарочных часов.</w:t>
-      </w:r>
+    </w:p>
+    <w:tbl>
+      <w:tblPr>
+        <w:tblW w:type="auto" w:w="0"/>
+        <w:tblLook w:firstColumn="1" w:firstRow="1" w:lastColumn="0" w:lastRow="0" w:noHBand="0" w:noVBand="1" w:val="04A0"/>
+        <w:tblBorders>
+          <w:top w:val="single" w:sz="8" w:space="0" w:color="F0C14A"/>
+          <w:left w:val="single" w:sz="8" w:space="0" w:color="F0C14A"/>
+          <w:bottom w:val="single" w:sz="8" w:space="0" w:color="F0C14A"/>
+          <w:right w:val="single" w:sz="8" w:space="0" w:color="F0C14A"/>
+          <w:insideH w:val="single" w:sz="8" w:space="0" w:color="F0C14A"/>
+          <w:insideV w:val="single" w:sz="8" w:space="0" w:color="F0C14A"/>
+        </w:tblBorders>
+      </w:tblPr>
+      <w:tblGrid>
+        <w:gridCol w:w="5159"/>
+        <w:gridCol w:w="5159"/>
+      </w:tblGrid>
+      <w:tr>
+        <w:tc>
+          <w:tcPr>
+            <w:tcW w:type="dxa" w:w="850"/>
+            <w:shd w:fill="F0C14A" w:val="clear"/>
+          </w:tcPr>
+          <w:p>
+            <w:pPr>
+              <w:jc w:val="center"/>
+            </w:pPr>
+            <w:r>
+              <w:rPr>
+                <w:rFonts w:ascii="Arial" w:hAnsi="Arial" w:eastAsia="Arial"/>
+                <w:b/>
+                <w:sz w:val="28"/>
+              </w:rPr>
+              <w:t>03</w:t>
+            </w:r>
+          </w:p>
+        </w:tc>
+        <w:tc>
+          <w:tcPr>
+            <w:tcW w:type="dxa" w:w="5159"/>
+            <w:shd w:fill="FFFBEA" w:val="clear"/>
+          </w:tcPr>
+          <w:p>
+            <w:r>
+              <w:rPr>
+                <w:rFonts w:ascii="Arial" w:hAnsi="Arial" w:eastAsia="Arial"/>
+                <w:b/>
+                <w:sz w:val="20"/>
+              </w:rPr>
+              <w:t>Прозрачная цена</w:t>
+            </w:r>
+          </w:p>
+          <w:p>
+            <w:r>
+              <w:rPr>
+                <w:rFonts w:ascii="Arial" w:hAnsi="Arial" w:eastAsia="Arial"/>
+                <w:b w:val="0"/>
+                <w:color w:val="666666"/>
+                <w:sz w:val="18"/>
+              </w:rPr>
+              <w:t>В счёте — только пакет кабинетов. Часы на настройку и стартовые вопросы уже внутри подарка.</w:t>
+            </w:r>
+          </w:p>
+        </w:tc>
+      </w:tr>
+    </w:tbl>
+    <w:p>
+      <w:pPr>
+        <w:spacing w:after="80"/>
+      </w:pPr>
     </w:p>
     <w:p>
       <w:pPr>
-        <w:spacing w:after="80" w:before="0"/>
+        <w:spacing w:after="40" w:before="0"/>
         <w:pBdr>
-          <w:bottom w:val="single" w:sz="18" w:space="2" w:color="F0C14A"/>
+          <w:bottom w:val="single" w:sz="20" w:space="2" w:color="F0C14A"/>
         </w:pBdr>
       </w:pPr>
       <w:r>
         <w:rPr>
           <w:rFonts w:ascii="Arial" w:hAnsi="Arial" w:eastAsia="Arial"/>
           <w:b/>
-          <w:color w:val="1A1A1A"/>
-          <w:sz w:val="24"/>
+          <w:color w:val="2B2B2B"/>
+          <w:sz w:val="26"/>
         </w:rPr>
-        <w:t>1. Условия</w:t>
-      </w:r>
-    </w:p>
-    <w:p>
-      <w:pPr>
-        <w:spacing w:after="60" w:before="0"/>
-      </w:pPr>
-      <w:r>
-        <w:rPr>
-          <w:rFonts w:ascii="Arial" w:hAnsi="Arial" w:eastAsia="Arial"/>
-          <w:b/>
-          <w:color w:val="F0C14A"/>
-          <w:sz w:val="20"/>
-        </w:rPr>
-        <w:t xml:space="preserve">✓  </w:t>
-      </w:r>
-      <w:r>
-        <w:rPr>
-          <w:rFonts w:ascii="Arial" w:hAnsi="Arial" w:eastAsia="Arial"/>
-          <w:b w:val="0"/>
-          <w:color w:val="1A1A1A"/>
-          <w:sz w:val="20"/>
-        </w:rPr>
-        <w:t>Подключаем сервис «1С:Кабинет сотрудника» на 750 личных кабинетов сроком на 12 месяцев.</w:t>
-      </w:r>
-    </w:p>
-    <w:p>
-      <w:pPr>
-        <w:spacing w:after="60" w:before="0"/>
-      </w:pPr>
-      <w:r>
-        <w:rPr>
-          <w:rFonts w:ascii="Arial" w:hAnsi="Arial" w:eastAsia="Arial"/>
-          <w:b/>
-          <w:color w:val="F0C14A"/>
-          <w:sz w:val="20"/>
-        </w:rPr>
-        <w:t xml:space="preserve">✓  </w:t>
-      </w:r>
-      <w:r>
-        <w:rPr>
-          <w:rFonts w:ascii="Arial" w:hAnsi="Arial" w:eastAsia="Arial"/>
-          <w:b w:val="0"/>
-          <w:color w:val="1A1A1A"/>
-          <w:sz w:val="20"/>
-        </w:rPr>
-        <w:t>В запуск входит: подключение к вашей 1С, настройка ролей и правил, помощь с выпуском электронных подписей, запуск пилотной группы и инструкции для сотрудников.</w:t>
-      </w:r>
-    </w:p>
-    <w:p>
-      <w:pPr>
-        <w:spacing w:after="60" w:before="0"/>
-      </w:pPr>
-      <w:r>
-        <w:rPr>
-          <w:rFonts w:ascii="Arial" w:hAnsi="Arial" w:eastAsia="Arial"/>
-          <w:b/>
-          <w:color w:val="F0C14A"/>
-          <w:sz w:val="20"/>
-        </w:rPr>
-        <w:t xml:space="preserve">✓  </w:t>
-      </w:r>
-      <w:r>
-        <w:rPr>
-          <w:rFonts w:ascii="Arial" w:hAnsi="Arial" w:eastAsia="Arial"/>
-          <w:b w:val="0"/>
-          <w:color w:val="1A1A1A"/>
-          <w:sz w:val="20"/>
-        </w:rPr>
-        <w:t>5 часов линии консультаций начисляются в подарок. Около 4 часов — настройка и запуск; 1 час остаётся на дополнительные вопросы и помощь по 1С.</w:t>
-      </w:r>
-    </w:p>
-    <w:p>
-      <w:pPr>
-        <w:spacing w:after="60" w:before="0"/>
-      </w:pPr>
-      <w:r>
-        <w:rPr>
-          <w:rFonts w:ascii="Arial" w:hAnsi="Arial" w:eastAsia="Arial"/>
-          <w:b/>
-          <w:color w:val="F0C14A"/>
-          <w:sz w:val="20"/>
-        </w:rPr>
-        <w:t xml:space="preserve">✓  </w:t>
-      </w:r>
-      <w:r>
-        <w:rPr>
-          <w:rFonts w:ascii="Arial" w:hAnsi="Arial" w:eastAsia="Arial"/>
-          <w:b w:val="0"/>
-          <w:color w:val="1A1A1A"/>
-          <w:sz w:val="20"/>
-        </w:rPr>
-        <w:t>За часы линии консультаций клиент не платит.</w:t>
-      </w:r>
-    </w:p>
-    <w:p>
-      <w:pPr>
-        <w:spacing w:after="60" w:before="0"/>
-      </w:pPr>
-      <w:r>
-        <w:rPr>
-          <w:rFonts w:ascii="Arial" w:hAnsi="Arial" w:eastAsia="Arial"/>
-          <w:b/>
-          <w:color w:val="F0C14A"/>
-          <w:sz w:val="20"/>
-        </w:rPr>
-        <w:t xml:space="preserve">✓  </w:t>
-      </w:r>
-      <w:r>
-        <w:rPr>
-          <w:rFonts w:ascii="Arial" w:hAnsi="Arial" w:eastAsia="Arial"/>
-          <w:b w:val="0"/>
-          <w:color w:val="1A1A1A"/>
-          <w:sz w:val="20"/>
-        </w:rPr>
-        <w:t>Электронная подпись для сотрудников (усиленная неквалифицированная) — бесплатно.</w:t>
-      </w:r>
-    </w:p>
-    <w:p>
-      <w:pPr>
-        <w:spacing w:after="60" w:before="0"/>
-      </w:pPr>
-      <w:r>
-        <w:rPr>
-          <w:rFonts w:ascii="Arial" w:hAnsi="Arial" w:eastAsia="Arial"/>
-          <w:b/>
-          <w:color w:val="F0C14A"/>
-          <w:sz w:val="20"/>
-        </w:rPr>
-        <w:t xml:space="preserve">✓  </w:t>
-      </w:r>
-      <w:r>
-        <w:rPr>
-          <w:rFonts w:ascii="Arial" w:hAnsi="Arial" w:eastAsia="Arial"/>
-          <w:b w:val="0"/>
-          <w:color w:val="1A1A1A"/>
-          <w:sz w:val="20"/>
-        </w:rPr>
-        <w:t>Предоставляем шаблоны документов для перехода: положение, уведомления, согласия.</w:t>
-      </w:r>
-    </w:p>
-    <w:p>
-      <w:pPr>
-        <w:spacing w:after="60" w:before="0"/>
-      </w:pPr>
-      <w:r>
-        <w:rPr>
-          <w:rFonts w:ascii="Arial" w:hAnsi="Arial" w:eastAsia="Arial"/>
-          <w:b/>
-          <w:color w:val="F0C14A"/>
-          <w:sz w:val="20"/>
-        </w:rPr>
-        <w:t xml:space="preserve">✓  </w:t>
-      </w:r>
-      <w:r>
-        <w:rPr>
-          <w:rFonts w:ascii="Arial" w:hAnsi="Arial" w:eastAsia="Arial"/>
-          <w:b w:val="0"/>
-          <w:color w:val="1A1A1A"/>
-          <w:sz w:val="20"/>
-        </w:rPr>
-        <w:t>Работы выполняются удалённо. Выезд и нетиповые доработки — по отдельному согласованию.</w:t>
-      </w:r>
-    </w:p>
-    <w:p>
-      <w:pPr>
-        <w:spacing w:after="60" w:before="0"/>
-      </w:pPr>
-      <w:r>
-        <w:rPr>
-          <w:rFonts w:ascii="Arial" w:hAnsi="Arial" w:eastAsia="Arial"/>
-          <w:b/>
-          <w:color w:val="F0C14A"/>
-          <w:sz w:val="20"/>
-        </w:rPr>
-        <w:t xml:space="preserve">✓  </w:t>
-      </w:r>
-      <w:r>
-        <w:rPr>
-          <w:rFonts w:ascii="Arial" w:hAnsi="Arial" w:eastAsia="Arial"/>
-          <w:b w:val="0"/>
-          <w:color w:val="1A1A1A"/>
-          <w:sz w:val="20"/>
-        </w:rPr>
-        <w:t>Коммерческое предложение действует 30 календарных дней с даты направления.</w:t>
-      </w:r>
-    </w:p>
-    <w:p>
-      <w:pPr>
-        <w:spacing w:after="80" w:before="0"/>
-        <w:pBdr>
-          <w:bottom w:val="single" w:sz="18" w:space="2" w:color="F0C14A"/>
-        </w:pBdr>
-      </w:pPr>
-      <w:r>
-        <w:rPr>
-          <w:rFonts w:ascii="Arial" w:hAnsi="Arial" w:eastAsia="Arial"/>
-          <w:b/>
-          <w:color w:val="1A1A1A"/>
-          <w:sz w:val="24"/>
-        </w:rPr>
-        <w:t>2. Сроки</w:t>
-      </w:r>
-    </w:p>
-    <w:p>
-      <w:pPr>
-        <w:spacing w:after="120" w:before="0"/>
-      </w:pPr>
-      <w:r>
-        <w:rPr>
-          <w:rFonts w:ascii="Arial" w:hAnsi="Arial" w:eastAsia="Arial"/>
-          <w:b w:val="0"/>
-          <w:color w:val="5A5A5A"/>
-          <w:sz w:val="18"/>
-        </w:rPr>
-        <w:t>Внедрение простое: без отдельной платформы и без долгого проектного цикла.</w:t>
+        <w:t>Сравнение для выбора подрядчика</w:t>
       </w:r>
     </w:p>
     <w:tbl>
@@ -942,12 +830,12 @@
         <w:tblW w:type="auto" w:w="0"/>
         <w:tblLook w:firstColumn="1" w:firstRow="1" w:lastColumn="0" w:lastRow="0" w:noHBand="0" w:noVBand="1" w:val="04A0"/>
         <w:tblBorders>
-          <w:top w:val="single" w:sz="4" w:space="0" w:color="CCCCCC"/>
-          <w:left w:val="single" w:sz="4" w:space="0" w:color="CCCCCC"/>
-          <w:bottom w:val="single" w:sz="4" w:space="0" w:color="CCCCCC"/>
-          <w:right w:val="single" w:sz="4" w:space="0" w:color="CCCCCC"/>
-          <w:insideH w:val="single" w:sz="4" w:space="0" w:color="CCCCCC"/>
-          <w:insideV w:val="single" w:sz="4" w:space="0" w:color="CCCCCC"/>
+          <w:top w:val="single" w:sz="8" w:space="0" w:color="F0C14A"/>
+          <w:left w:val="single" w:sz="8" w:space="0" w:color="F0C14A"/>
+          <w:bottom w:val="single" w:sz="8" w:space="0" w:color="F0C14A"/>
+          <w:right w:val="single" w:sz="8" w:space="0" w:color="F0C14A"/>
+          <w:insideH w:val="single" w:sz="8" w:space="0" w:color="F0C14A"/>
+          <w:insideV w:val="single" w:sz="8" w:space="0" w:color="F0C14A"/>
         </w:tblBorders>
       </w:tblPr>
       <w:tblGrid>
@@ -959,766 +847,14 @@
         <w:tc>
           <w:tcPr>
             <w:tcW w:type="dxa" w:w="3439"/>
-            <w:shd w:fill="1A1A1A" w:val="clear"/>
+            <w:shd w:fill="F0C14A" w:val="clear"/>
           </w:tcPr>
           <w:p>
             <w:r>
               <w:rPr>
                 <w:rFonts w:ascii="Arial" w:hAnsi="Arial" w:eastAsia="Arial"/>
                 <w:b/>
-                <w:color w:val="FFFFFF"/>
                 <w:sz w:val="18"/>
-              </w:rPr>
-              <w:t>Этап</w:t>
-            </w:r>
-          </w:p>
-        </w:tc>
-        <w:tc>
-          <w:tcPr>
-            <w:tcW w:type="dxa" w:w="3439"/>
-            <w:shd w:fill="1A1A1A" w:val="clear"/>
-          </w:tcPr>
-          <w:p>
-            <w:r>
-              <w:rPr>
-                <w:rFonts w:ascii="Arial" w:hAnsi="Arial" w:eastAsia="Arial"/>
-                <w:b/>
-                <w:color w:val="FFFFFF"/>
-                <w:sz w:val="18"/>
-              </w:rPr>
-              <w:t>Срок</w:t>
-            </w:r>
-          </w:p>
-        </w:tc>
-        <w:tc>
-          <w:tcPr>
-            <w:tcW w:type="dxa" w:w="3439"/>
-            <w:shd w:fill="1A1A1A" w:val="clear"/>
-          </w:tcPr>
-          <w:p>
-            <w:r>
-              <w:rPr>
-                <w:rFonts w:ascii="Arial" w:hAnsi="Arial" w:eastAsia="Arial"/>
-                <w:b/>
-                <w:color w:val="FFFFFF"/>
-                <w:sz w:val="18"/>
-              </w:rPr>
-              <w:t>Результат</w:t>
-            </w:r>
-          </w:p>
-        </w:tc>
-      </w:tr>
-      <w:tr>
-        <w:tc>
-          <w:tcPr>
-            <w:tcW w:type="dxa" w:w="3439"/>
-          </w:tcPr>
-          <w:p>
-            <w:r>
-              <w:rPr>
-                <w:rFonts w:ascii="Arial" w:hAnsi="Arial" w:eastAsia="Arial"/>
-                <w:b/>
-                <w:sz w:val="16"/>
-              </w:rPr>
-              <w:t>Договор и доступы к 1С</w:t>
-            </w:r>
-          </w:p>
-        </w:tc>
-        <w:tc>
-          <w:tcPr>
-            <w:tcW w:type="dxa" w:w="3439"/>
-          </w:tcPr>
-          <w:p>
-            <w:r>
-              <w:rPr>
-                <w:rFonts w:ascii="Arial" w:hAnsi="Arial" w:eastAsia="Arial"/>
-                <w:b/>
-                <w:sz w:val="16"/>
-              </w:rPr>
-              <w:t>2–4 рабочих дня</w:t>
-            </w:r>
-          </w:p>
-        </w:tc>
-        <w:tc>
-          <w:tcPr>
-            <w:tcW w:type="dxa" w:w="3439"/>
-          </w:tcPr>
-          <w:p>
-            <w:r>
-              <w:rPr>
-                <w:rFonts w:ascii="Arial" w:hAnsi="Arial" w:eastAsia="Arial"/>
-                <w:b w:val="0"/>
-                <w:sz w:val="16"/>
-              </w:rPr>
-              <w:t>Можно начинать настройку</w:t>
-            </w:r>
-          </w:p>
-        </w:tc>
-      </w:tr>
-      <w:tr>
-        <w:tc>
-          <w:tcPr>
-            <w:tcW w:type="dxa" w:w="3439"/>
-          </w:tcPr>
-          <w:p>
-            <w:r>
-              <w:rPr>
-                <w:rFonts w:ascii="Arial" w:hAnsi="Arial" w:eastAsia="Arial"/>
-                <w:b/>
-                <w:sz w:val="16"/>
-              </w:rPr>
-              <w:t>Настройка и запуск (около 4 часов)</w:t>
-            </w:r>
-          </w:p>
-        </w:tc>
-        <w:tc>
-          <w:tcPr>
-            <w:tcW w:type="dxa" w:w="3439"/>
-          </w:tcPr>
-          <w:p>
-            <w:r>
-              <w:rPr>
-                <w:rFonts w:ascii="Arial" w:hAnsi="Arial" w:eastAsia="Arial"/>
-                <w:b/>
-                <w:sz w:val="16"/>
-              </w:rPr>
-              <w:t>1 рабочий день</w:t>
-            </w:r>
-          </w:p>
-        </w:tc>
-        <w:tc>
-          <w:tcPr>
-            <w:tcW w:type="dxa" w:w="3439"/>
-          </w:tcPr>
-          <w:p>
-            <w:r>
-              <w:rPr>
-                <w:rFonts w:ascii="Arial" w:hAnsi="Arial" w:eastAsia="Arial"/>
-                <w:b w:val="0"/>
-                <w:sz w:val="16"/>
-              </w:rPr>
-              <w:t>Сервис подключен, роли и подписи настроены</w:t>
-            </w:r>
-          </w:p>
-        </w:tc>
-      </w:tr>
-      <w:tr>
-        <w:tc>
-          <w:tcPr>
-            <w:tcW w:type="dxa" w:w="3439"/>
-          </w:tcPr>
-          <w:p>
-            <w:r>
-              <w:rPr>
-                <w:rFonts w:ascii="Arial" w:hAnsi="Arial" w:eastAsia="Arial"/>
-                <w:b/>
-                <w:sz w:val="16"/>
-              </w:rPr>
-              <w:t>Пилот на небольшой группе</w:t>
-            </w:r>
-          </w:p>
-        </w:tc>
-        <w:tc>
-          <w:tcPr>
-            <w:tcW w:type="dxa" w:w="3439"/>
-          </w:tcPr>
-          <w:p>
-            <w:r>
-              <w:rPr>
-                <w:rFonts w:ascii="Arial" w:hAnsi="Arial" w:eastAsia="Arial"/>
-                <w:b/>
-                <w:sz w:val="16"/>
-              </w:rPr>
-              <w:t>3–7 рабочих дней</w:t>
-            </w:r>
-          </w:p>
-        </w:tc>
-        <w:tc>
-          <w:tcPr>
-            <w:tcW w:type="dxa" w:w="3439"/>
-          </w:tcPr>
-          <w:p>
-            <w:r>
-              <w:rPr>
-                <w:rFonts w:ascii="Arial" w:hAnsi="Arial" w:eastAsia="Arial"/>
-                <w:b w:val="0"/>
-                <w:sz w:val="16"/>
-              </w:rPr>
-              <w:t>Проверен рабочий сценарий</w:t>
-            </w:r>
-          </w:p>
-        </w:tc>
-      </w:tr>
-      <w:tr>
-        <w:tc>
-          <w:tcPr>
-            <w:tcW w:type="dxa" w:w="3439"/>
-          </w:tcPr>
-          <w:p>
-            <w:r>
-              <w:rPr>
-                <w:rFonts w:ascii="Arial" w:hAnsi="Arial" w:eastAsia="Arial"/>
-                <w:b/>
-                <w:sz w:val="16"/>
-              </w:rPr>
-              <w:t>Обучение ключевых сотрудников</w:t>
-            </w:r>
-          </w:p>
-        </w:tc>
-        <w:tc>
-          <w:tcPr>
-            <w:tcW w:type="dxa" w:w="3439"/>
-          </w:tcPr>
-          <w:p>
-            <w:r>
-              <w:rPr>
-                <w:rFonts w:ascii="Arial" w:hAnsi="Arial" w:eastAsia="Arial"/>
-                <w:b/>
-                <w:sz w:val="16"/>
-              </w:rPr>
-              <w:t>параллельно</w:t>
-            </w:r>
-          </w:p>
-        </w:tc>
-        <w:tc>
-          <w:tcPr>
-            <w:tcW w:type="dxa" w:w="3439"/>
-          </w:tcPr>
-          <w:p>
-            <w:r>
-              <w:rPr>
-                <w:rFonts w:ascii="Arial" w:hAnsi="Arial" w:eastAsia="Arial"/>
-                <w:b w:val="0"/>
-                <w:sz w:val="16"/>
-              </w:rPr>
-              <w:t>Видеоуроки и короткие инструкции</w:t>
-            </w:r>
-          </w:p>
-        </w:tc>
-      </w:tr>
-      <w:tr>
-        <w:tc>
-          <w:tcPr>
-            <w:tcW w:type="dxa" w:w="3439"/>
-          </w:tcPr>
-          <w:p>
-            <w:r>
-              <w:rPr>
-                <w:rFonts w:ascii="Arial" w:hAnsi="Arial" w:eastAsia="Arial"/>
-                <w:b/>
-                <w:sz w:val="16"/>
-              </w:rPr>
-              <w:t>Подключение всех 750 сотрудников</w:t>
-            </w:r>
-          </w:p>
-        </w:tc>
-        <w:tc>
-          <w:tcPr>
-            <w:tcW w:type="dxa" w:w="3439"/>
-          </w:tcPr>
-          <w:p>
-            <w:r>
-              <w:rPr>
-                <w:rFonts w:ascii="Arial" w:hAnsi="Arial" w:eastAsia="Arial"/>
-                <w:b/>
-                <w:sz w:val="16"/>
-              </w:rPr>
-              <w:t>2–3 недели</w:t>
-            </w:r>
-          </w:p>
-        </w:tc>
-        <w:tc>
-          <w:tcPr>
-            <w:tcW w:type="dxa" w:w="3439"/>
-          </w:tcPr>
-          <w:p>
-            <w:r>
-              <w:rPr>
-                <w:rFonts w:ascii="Arial" w:hAnsi="Arial" w:eastAsia="Arial"/>
-                <w:b w:val="0"/>
-                <w:sz w:val="16"/>
-              </w:rPr>
-              <w:t>Массовый запуск личных кабинетов</w:t>
-            </w:r>
-          </w:p>
-        </w:tc>
-      </w:tr>
-      <w:tr>
-        <w:tc>
-          <w:tcPr>
-            <w:tcW w:type="dxa" w:w="3439"/>
-          </w:tcPr>
-          <w:p>
-            <w:r>
-              <w:rPr>
-                <w:rFonts w:ascii="Arial" w:hAnsi="Arial" w:eastAsia="Arial"/>
-                <w:b/>
-                <w:sz w:val="16"/>
-              </w:rPr>
-              <w:t>Резерв 1 час поддержки</w:t>
-            </w:r>
-          </w:p>
-        </w:tc>
-        <w:tc>
-          <w:tcPr>
-            <w:tcW w:type="dxa" w:w="3439"/>
-          </w:tcPr>
-          <w:p>
-            <w:r>
-              <w:rPr>
-                <w:rFonts w:ascii="Arial" w:hAnsi="Arial" w:eastAsia="Arial"/>
-                <w:b/>
-                <w:sz w:val="16"/>
-              </w:rPr>
-              <w:t>по запросу</w:t>
-            </w:r>
-          </w:p>
-        </w:tc>
-        <w:tc>
-          <w:tcPr>
-            <w:tcW w:type="dxa" w:w="3439"/>
-          </w:tcPr>
-          <w:p>
-            <w:r>
-              <w:rPr>
-                <w:rFonts w:ascii="Arial" w:hAnsi="Arial" w:eastAsia="Arial"/>
-                <w:b w:val="0"/>
-                <w:sz w:val="16"/>
-              </w:rPr>
-              <w:t>Вопросы и помощь по 1С после запуска</w:t>
-            </w:r>
-          </w:p>
-        </w:tc>
-      </w:tr>
-    </w:tbl>
-    <w:p>
-      <w:pPr>
-        <w:spacing w:after="200" w:before="0"/>
-      </w:pPr>
-      <w:r>
-        <w:rPr>
-          <w:rFonts w:ascii="Arial" w:hAnsi="Arial" w:eastAsia="Arial"/>
-          <w:b/>
-          <w:color w:val="1A1A1A"/>
-          <w:sz w:val="18"/>
-        </w:rPr>
-        <w:t>Ориентир: настройка за 1 день · пилот за 1–2 недели · все 750 кабинетов за 1–1,5 месяца.</w:t>
-      </w:r>
-    </w:p>
-    <w:p>
-      <w:pPr>
-        <w:spacing w:after="80" w:before="0"/>
-        <w:pBdr>
-          <w:bottom w:val="single" w:sz="18" w:space="2" w:color="F0C14A"/>
-        </w:pBdr>
-      </w:pPr>
-      <w:r>
-        <w:rPr>
-          <w:rFonts w:ascii="Arial" w:hAnsi="Arial" w:eastAsia="Arial"/>
-          <w:b/>
-          <w:color w:val="1A1A1A"/>
-          <w:sz w:val="24"/>
-        </w:rPr>
-        <w:t>3. Бюджет</w:t>
-      </w:r>
-    </w:p>
-    <w:tbl>
-      <w:tblPr>
-        <w:tblW w:type="auto" w:w="0"/>
-        <w:tblLook w:firstColumn="1" w:firstRow="1" w:lastColumn="0" w:lastRow="0" w:noHBand="0" w:noVBand="1" w:val="04A0"/>
-        <w:tblBorders>
-          <w:top w:val="single" w:sz="4" w:space="0" w:color="CCCCCC"/>
-          <w:left w:val="single" w:sz="4" w:space="0" w:color="CCCCCC"/>
-          <w:bottom w:val="single" w:sz="4" w:space="0" w:color="CCCCCC"/>
-          <w:right w:val="single" w:sz="4" w:space="0" w:color="CCCCCC"/>
-          <w:insideH w:val="single" w:sz="4" w:space="0" w:color="CCCCCC"/>
-          <w:insideV w:val="single" w:sz="4" w:space="0" w:color="CCCCCC"/>
-        </w:tblBorders>
-      </w:tblPr>
-      <w:tblGrid>
-        <w:gridCol w:w="3439"/>
-        <w:gridCol w:w="3439"/>
-        <w:gridCol w:w="3439"/>
-      </w:tblGrid>
-      <w:tr>
-        <w:tc>
-          <w:tcPr>
-            <w:tcW w:type="dxa" w:w="3439"/>
-            <w:shd w:fill="1A1A1A" w:val="clear"/>
-          </w:tcPr>
-          <w:p>
-            <w:r>
-              <w:rPr>
-                <w:rFonts w:ascii="Arial" w:hAnsi="Arial" w:eastAsia="Arial"/>
-                <w:b/>
-                <w:color w:val="FFFFFF"/>
-                <w:sz w:val="18"/>
-              </w:rPr>
-              <w:t>Статья</w:t>
-            </w:r>
-          </w:p>
-        </w:tc>
-        <w:tc>
-          <w:tcPr>
-            <w:tcW w:type="dxa" w:w="3439"/>
-            <w:shd w:fill="1A1A1A" w:val="clear"/>
-          </w:tcPr>
-          <w:p>
-            <w:r>
-              <w:rPr>
-                <w:rFonts w:ascii="Arial" w:hAnsi="Arial" w:eastAsia="Arial"/>
-                <w:b/>
-                <w:color w:val="FFFFFF"/>
-                <w:sz w:val="18"/>
-              </w:rPr>
-              <w:t>Пояснение</w:t>
-            </w:r>
-          </w:p>
-        </w:tc>
-        <w:tc>
-          <w:tcPr>
-            <w:tcW w:type="dxa" w:w="3439"/>
-            <w:shd w:fill="1A1A1A" w:val="clear"/>
-          </w:tcPr>
-          <w:p>
-            <w:r>
-              <w:rPr>
-                <w:rFonts w:ascii="Arial" w:hAnsi="Arial" w:eastAsia="Arial"/>
-                <w:b/>
-                <w:color w:val="FFFFFF"/>
-                <w:sz w:val="18"/>
-              </w:rPr>
-              <w:t>Сумма</w:t>
-            </w:r>
-          </w:p>
-        </w:tc>
-      </w:tr>
-      <w:tr>
-        <w:tc>
-          <w:tcPr>
-            <w:tcW w:type="dxa" w:w="3439"/>
-          </w:tcPr>
-          <w:p>
-            <w:r>
-              <w:rPr>
-                <w:rFonts w:ascii="Arial" w:hAnsi="Arial" w:eastAsia="Arial"/>
-                <w:b/>
-                <w:color w:val="1A1A1A"/>
-                <w:sz w:val="16"/>
-              </w:rPr>
-              <w:t>Личные кабинеты, 750 шт. / 12 месяцев</w:t>
-            </w:r>
-          </w:p>
-        </w:tc>
-        <w:tc>
-          <w:tcPr>
-            <w:tcW w:type="dxa" w:w="3439"/>
-          </w:tcPr>
-          <w:p>
-            <w:r>
-              <w:rPr>
-                <w:rFonts w:ascii="Arial" w:hAnsi="Arial" w:eastAsia="Arial"/>
-                <w:b w:val="0"/>
-                <w:color w:val="1A1A1A"/>
-                <w:sz w:val="16"/>
-              </w:rPr>
-              <w:t>Пакеты 500 + 200 + 50</w:t>
-            </w:r>
-          </w:p>
-        </w:tc>
-        <w:tc>
-          <w:tcPr>
-            <w:tcW w:type="dxa" w:w="3439"/>
-          </w:tcPr>
-          <w:p>
-            <w:r>
-              <w:rPr>
-                <w:rFonts w:ascii="Arial" w:hAnsi="Arial" w:eastAsia="Arial"/>
-                <w:b/>
-                <w:color w:val="1A1A1A"/>
-                <w:sz w:val="16"/>
-              </w:rPr>
-              <w:t>223 200 ₽</w:t>
-            </w:r>
-          </w:p>
-        </w:tc>
-      </w:tr>
-      <w:tr>
-        <w:tc>
-          <w:tcPr>
-            <w:tcW w:type="dxa" w:w="3439"/>
-            <w:shd w:fill="FFF8E8" w:val="clear"/>
-          </w:tcPr>
-          <w:p>
-            <w:r>
-              <w:rPr>
-                <w:rFonts w:ascii="Arial" w:hAnsi="Arial" w:eastAsia="Arial"/>
-                <w:b/>
-                <w:color w:val="1A1A1A"/>
-                <w:sz w:val="16"/>
-              </w:rPr>
-              <w:t>Настройка и запуск (~4 часа)</w:t>
-            </w:r>
-          </w:p>
-        </w:tc>
-        <w:tc>
-          <w:tcPr>
-            <w:tcW w:type="dxa" w:w="3439"/>
-            <w:shd w:fill="FFF8E8" w:val="clear"/>
-          </w:tcPr>
-          <w:p>
-            <w:r>
-              <w:rPr>
-                <w:rFonts w:ascii="Arial" w:hAnsi="Arial" w:eastAsia="Arial"/>
-                <w:b w:val="0"/>
-                <w:color w:val="1A1A1A"/>
-                <w:sz w:val="16"/>
-              </w:rPr>
-              <w:t>Из подарочных часов линии консультаций</w:t>
-            </w:r>
-          </w:p>
-        </w:tc>
-        <w:tc>
-          <w:tcPr>
-            <w:tcW w:type="dxa" w:w="3439"/>
-            <w:shd w:fill="FFF8E8" w:val="clear"/>
-          </w:tcPr>
-          <w:p>
-            <w:r>
-              <w:rPr>
-                <w:rFonts w:ascii="Arial" w:hAnsi="Arial" w:eastAsia="Arial"/>
-                <w:b/>
-                <w:color w:val="1F6B2E"/>
-                <w:sz w:val="16"/>
-              </w:rPr>
-              <w:t>0 ₽</w:t>
-            </w:r>
-          </w:p>
-        </w:tc>
-      </w:tr>
-      <w:tr>
-        <w:tc>
-          <w:tcPr>
-            <w:tcW w:type="dxa" w:w="3439"/>
-            <w:shd w:fill="FFF8E8" w:val="clear"/>
-          </w:tcPr>
-          <w:p>
-            <w:r>
-              <w:rPr>
-                <w:rFonts w:ascii="Arial" w:hAnsi="Arial" w:eastAsia="Arial"/>
-                <w:b/>
-                <w:color w:val="1A1A1A"/>
-                <w:sz w:val="16"/>
-              </w:rPr>
-              <w:t>Резерв на вопросы по 1С (1 час)</w:t>
-            </w:r>
-          </w:p>
-        </w:tc>
-        <w:tc>
-          <w:tcPr>
-            <w:tcW w:type="dxa" w:w="3439"/>
-            <w:shd w:fill="FFF8E8" w:val="clear"/>
-          </w:tcPr>
-          <w:p>
-            <w:r>
-              <w:rPr>
-                <w:rFonts w:ascii="Arial" w:hAnsi="Arial" w:eastAsia="Arial"/>
-                <w:b w:val="0"/>
-                <w:color w:val="1A1A1A"/>
-                <w:sz w:val="16"/>
-              </w:rPr>
-              <w:t>Из подарочных часов линии консультаций</w:t>
-            </w:r>
-          </w:p>
-        </w:tc>
-        <w:tc>
-          <w:tcPr>
-            <w:tcW w:type="dxa" w:w="3439"/>
-            <w:shd w:fill="FFF8E8" w:val="clear"/>
-          </w:tcPr>
-          <w:p>
-            <w:r>
-              <w:rPr>
-                <w:rFonts w:ascii="Arial" w:hAnsi="Arial" w:eastAsia="Arial"/>
-                <w:b/>
-                <w:color w:val="1F6B2E"/>
-                <w:sz w:val="16"/>
-              </w:rPr>
-              <w:t>0 ₽</w:t>
-            </w:r>
-          </w:p>
-        </w:tc>
-      </w:tr>
-      <w:tr>
-        <w:tc>
-          <w:tcPr>
-            <w:tcW w:type="dxa" w:w="3439"/>
-            <w:shd w:fill="FFF8E8" w:val="clear"/>
-          </w:tcPr>
-          <w:p>
-            <w:r>
-              <w:rPr>
-                <w:rFonts w:ascii="Arial" w:hAnsi="Arial" w:eastAsia="Arial"/>
-                <w:b/>
-                <w:color w:val="1A1A1A"/>
-                <w:sz w:val="16"/>
-              </w:rPr>
-              <w:t>Подарок: 5 часов линии консультаций</w:t>
-            </w:r>
-          </w:p>
-        </w:tc>
-        <w:tc>
-          <w:tcPr>
-            <w:tcW w:type="dxa" w:w="3439"/>
-            <w:shd w:fill="FFF8E8" w:val="clear"/>
-          </w:tcPr>
-          <w:p>
-            <w:r>
-              <w:rPr>
-                <w:rFonts w:ascii="Arial" w:hAnsi="Arial" w:eastAsia="Arial"/>
-                <w:b w:val="0"/>
-                <w:color w:val="1A1A1A"/>
-                <w:sz w:val="16"/>
-              </w:rPr>
-              <w:t>Акция «Больше  чем кешбэк!» · выгода 18 300 ₽</w:t>
-            </w:r>
-          </w:p>
-        </w:tc>
-        <w:tc>
-          <w:tcPr>
-            <w:tcW w:type="dxa" w:w="3439"/>
-            <w:shd w:fill="FFF8E8" w:val="clear"/>
-          </w:tcPr>
-          <w:p>
-            <w:r>
-              <w:rPr>
-                <w:rFonts w:ascii="Arial" w:hAnsi="Arial" w:eastAsia="Arial"/>
-                <w:b/>
-                <w:color w:val="1F6B2E"/>
-                <w:sz w:val="16"/>
-              </w:rPr>
-              <w:t>0 ₽</w:t>
-            </w:r>
-          </w:p>
-        </w:tc>
-      </w:tr>
-    </w:tbl>
-    <w:tbl>
-      <w:tblPr>
-        <w:tblW w:type="auto" w:w="0"/>
-        <w:tblLook w:firstColumn="1" w:firstRow="1" w:lastColumn="0" w:lastRow="0" w:noHBand="0" w:noVBand="1" w:val="04A0"/>
-        <w:tblBorders>
-          <w:top w:val="single" w:sz="4" w:space="0" w:color="F0C14A"/>
-          <w:left w:val="single" w:sz="4" w:space="0" w:color="F0C14A"/>
-          <w:bottom w:val="single" w:sz="4" w:space="0" w:color="F0C14A"/>
-          <w:right w:val="single" w:sz="4" w:space="0" w:color="F0C14A"/>
-          <w:insideH w:val="single" w:sz="4" w:space="0" w:color="F0C14A"/>
-          <w:insideV w:val="single" w:sz="4" w:space="0" w:color="F0C14A"/>
-        </w:tblBorders>
-      </w:tblPr>
-      <w:tblGrid>
-        <w:gridCol w:w="5159"/>
-        <w:gridCol w:w="5159"/>
-      </w:tblGrid>
-      <w:tr>
-        <w:tc>
-          <w:tcPr>
-            <w:tcW w:type="dxa" w:w="5159"/>
-            <w:shd w:fill="1A1A1A" w:val="clear"/>
-          </w:tcPr>
-          <w:p>
-            <w:r>
-              <w:rPr>
-                <w:rFonts w:ascii="Arial" w:hAnsi="Arial" w:eastAsia="Arial"/>
-                <w:b/>
-                <w:color w:val="F0C14A"/>
-                <w:sz w:val="22"/>
-              </w:rPr>
-              <w:t>Итого к оплате</w:t>
-            </w:r>
-          </w:p>
-          <w:p>
-            <w:r>
-              <w:rPr>
-                <w:rFonts w:ascii="Arial" w:hAnsi="Arial" w:eastAsia="Arial"/>
-                <w:b w:val="0"/>
-                <w:color w:val="FFFFFF"/>
-                <w:sz w:val="16"/>
-              </w:rPr>
-              <w:t>Только пакет кабинетов. Часы линии — бесплатно.</w:t>
-            </w:r>
-          </w:p>
-        </w:tc>
-        <w:tc>
-          <w:tcPr>
-            <w:tcW w:type="dxa" w:w="5159"/>
-            <w:shd w:fill="1A1A1A" w:val="clear"/>
-          </w:tcPr>
-          <w:p>
-            <w:pPr>
-              <w:jc w:val="right"/>
-            </w:pPr>
-            <w:r>
-              <w:rPr>
-                <w:rFonts w:ascii="Arial" w:hAnsi="Arial" w:eastAsia="Arial"/>
-                <w:b/>
-                <w:color w:val="F0C14A"/>
-                <w:sz w:val="32"/>
-              </w:rPr>
-              <w:t>223 200 ₽</w:t>
-            </w:r>
-          </w:p>
-        </w:tc>
-      </w:tr>
-    </w:tbl>
-    <w:p>
-      <w:pPr>
-        <w:spacing w:after="80" w:before="0"/>
-        <w:pBdr>
-          <w:bottom w:val="single" w:sz="18" w:space="2" w:color="F0C14A"/>
-        </w:pBdr>
-      </w:pPr>
-      <w:r>
-        <w:rPr>
-          <w:rFonts w:ascii="Arial" w:hAnsi="Arial" w:eastAsia="Arial"/>
-          <w:b/>
-          <w:color w:val="1A1A1A"/>
-          <w:sz w:val="24"/>
-        </w:rPr>
-        <w:t>Сравнение с другими решениями</w:t>
-      </w:r>
-    </w:p>
-    <w:tbl>
-      <w:tblPr>
-        <w:tblW w:type="auto" w:w="0"/>
-        <w:tblLook w:firstColumn="1" w:firstRow="1" w:lastColumn="0" w:lastRow="0" w:noHBand="0" w:noVBand="1" w:val="04A0"/>
-        <w:tblBorders>
-          <w:top w:val="single" w:sz="4" w:space="0" w:color="CCCCCC"/>
-          <w:left w:val="single" w:sz="4" w:space="0" w:color="CCCCCC"/>
-          <w:bottom w:val="single" w:sz="4" w:space="0" w:color="CCCCCC"/>
-          <w:right w:val="single" w:sz="4" w:space="0" w:color="CCCCCC"/>
-          <w:insideH w:val="single" w:sz="4" w:space="0" w:color="CCCCCC"/>
-          <w:insideV w:val="single" w:sz="4" w:space="0" w:color="CCCCCC"/>
-        </w:tblBorders>
-      </w:tblPr>
-      <w:tblGrid>
-        <w:gridCol w:w="3439"/>
-        <w:gridCol w:w="3439"/>
-        <w:gridCol w:w="3439"/>
-      </w:tblGrid>
-      <w:tr>
-        <w:tc>
-          <w:tcPr>
-            <w:tcW w:type="dxa" w:w="3439"/>
-            <w:shd w:fill="1A1A1A" w:val="clear"/>
-          </w:tcPr>
-          <w:p>
-            <w:r>
-              <w:rPr>
-                <w:rFonts w:ascii="Arial" w:hAnsi="Arial" w:eastAsia="Arial"/>
-                <w:b/>
-                <w:color w:val="FFFFFF"/>
-                <w:sz w:val="16"/>
               </w:rPr>
               <w:t>Критерий</w:t>
             </w:r>
@@ -1734,27 +870,25 @@
               <w:rPr>
                 <w:rFonts w:ascii="Arial" w:hAnsi="Arial" w:eastAsia="Arial"/>
                 <w:b/>
-                <w:color w:val="1A1A1A"/>
-                <w:sz w:val="16"/>
+                <w:sz w:val="18"/>
               </w:rPr>
-              <w:t>Форус + 1С:Кабинет сотрудника</w:t>
+              <w:t>Предложение Форус</w:t>
             </w:r>
           </w:p>
         </w:tc>
         <w:tc>
           <w:tcPr>
             <w:tcW w:type="dxa" w:w="3439"/>
-            <w:shd w:fill="1A1A1A" w:val="clear"/>
+            <w:shd w:fill="F0C14A" w:val="clear"/>
           </w:tcPr>
           <w:p>
             <w:r>
               <w:rPr>
                 <w:rFonts w:ascii="Arial" w:hAnsi="Arial" w:eastAsia="Arial"/>
                 <w:b/>
-                <w:color w:val="FFFFFF"/>
-                <w:sz w:val="16"/>
+                <w:sz w:val="18"/>
               </w:rPr>
-              <w:t>Другие операторы</w:t>
+              <w:t>Типичные альтернативы</w:t>
             </w:r>
           </w:p>
         </w:tc>
@@ -1769,44 +903,44 @@
               <w:rPr>
                 <w:rFonts w:ascii="Arial" w:hAnsi="Arial" w:eastAsia="Arial"/>
                 <w:b/>
-                <w:color w:val="1A1A1A"/>
+                <w:color w:val="2B2B2B"/>
                 <w:sz w:val="16"/>
               </w:rPr>
-              <w:t>Сложность запуска</w:t>
+              <w:t>Запуск</w:t>
             </w:r>
           </w:p>
         </w:tc>
         <w:tc>
           <w:tcPr>
             <w:tcW w:type="dxa" w:w="3439"/>
-            <w:shd w:fill="EAF6EA" w:val="clear"/>
+            <w:shd w:fill="E8F5E9" w:val="clear"/>
           </w:tcPr>
           <w:p>
             <w:r>
               <w:rPr>
                 <w:rFonts w:ascii="Arial" w:hAnsi="Arial" w:eastAsia="Arial"/>
                 <w:b w:val="0"/>
-                <w:color w:val="1F6B2E"/>
+                <w:color w:val="2E7D32"/>
                 <w:sz w:val="16"/>
               </w:rPr>
-              <w:t>Типовая настройка около 4 часов</w:t>
+              <w:t>Около 4 часов настройки</w:t>
             </w:r>
           </w:p>
         </w:tc>
         <w:tc>
           <w:tcPr>
             <w:tcW w:type="dxa" w:w="3439"/>
-            <w:shd w:fill="F9EAEA" w:val="clear"/>
+            <w:shd w:fill="FFEBEE" w:val="clear"/>
           </w:tcPr>
           <w:p>
             <w:r>
               <w:rPr>
                 <w:rFonts w:ascii="Arial" w:hAnsi="Arial" w:eastAsia="Arial"/>
                 <w:b w:val="0"/>
-                <w:color w:val="8C2020"/>
+                <w:color w:val="C62828"/>
                 <w:sz w:val="16"/>
               </w:rPr>
-              <w:t>Часто долгое внедрение новой системы</w:t>
+              <w:t>Часто долгое внедрение</w:t>
             </w:r>
           </w:p>
         </w:tc>
@@ -1821,41 +955,41 @@
               <w:rPr>
                 <w:rFonts w:ascii="Arial" w:hAnsi="Arial" w:eastAsia="Arial"/>
                 <w:b/>
-                <w:color w:val="1A1A1A"/>
+                <w:color w:val="2B2B2B"/>
                 <w:sz w:val="16"/>
               </w:rPr>
-              <w:t>Где работают сотрудники</w:t>
+              <w:t>Система</w:t>
             </w:r>
           </w:p>
         </w:tc>
         <w:tc>
           <w:tcPr>
             <w:tcW w:type="dxa" w:w="3439"/>
-            <w:shd w:fill="EAF6EA" w:val="clear"/>
+            <w:shd w:fill="E8F5E9" w:val="clear"/>
           </w:tcPr>
           <w:p>
             <w:r>
               <w:rPr>
                 <w:rFonts w:ascii="Arial" w:hAnsi="Arial" w:eastAsia="Arial"/>
                 <w:b w:val="0"/>
-                <w:color w:val="1F6B2E"/>
+                <w:color w:val="2E7D32"/>
                 <w:sz w:val="16"/>
               </w:rPr>
-              <w:t>В привычной 1С и личном кабинете</w:t>
+              <w:t>Внутри вашей 1С</w:t>
             </w:r>
           </w:p>
         </w:tc>
         <w:tc>
           <w:tcPr>
             <w:tcW w:type="dxa" w:w="3439"/>
-            <w:shd w:fill="F9EAEA" w:val="clear"/>
+            <w:shd w:fill="FFEBEE" w:val="clear"/>
           </w:tcPr>
           <w:p>
             <w:r>
               <w:rPr>
                 <w:rFonts w:ascii="Arial" w:hAnsi="Arial" w:eastAsia="Arial"/>
                 <w:b w:val="0"/>
-                <w:color w:val="8C2020"/>
+                <w:color w:val="C62828"/>
                 <w:sz w:val="16"/>
               </w:rPr>
               <w:t>Отдельная кадровая платформа</w:t>
@@ -1873,24 +1007,24 @@
               <w:rPr>
                 <w:rFonts w:ascii="Arial" w:hAnsi="Arial" w:eastAsia="Arial"/>
                 <w:b/>
-                <w:color w:val="1A1A1A"/>
+                <w:color w:val="2B2B2B"/>
                 <w:sz w:val="16"/>
               </w:rPr>
-              <w:t>Нагрузка на ИТ-отдел</w:t>
+              <w:t>ИТ-нагрузка</w:t>
             </w:r>
           </w:p>
         </w:tc>
         <w:tc>
           <w:tcPr>
             <w:tcW w:type="dxa" w:w="3439"/>
-            <w:shd w:fill="EAF6EA" w:val="clear"/>
+            <w:shd w:fill="E8F5E9" w:val="clear"/>
           </w:tcPr>
           <w:p>
             <w:r>
               <w:rPr>
                 <w:rFonts w:ascii="Arial" w:hAnsi="Arial" w:eastAsia="Arial"/>
                 <w:b w:val="0"/>
-                <w:color w:val="1F6B2E"/>
+                <w:color w:val="2E7D32"/>
                 <w:sz w:val="16"/>
               </w:rPr>
               <w:t>Без новых клиентских лицензий 1С</w:t>
@@ -1900,17 +1034,17 @@
         <w:tc>
           <w:tcPr>
             <w:tcW w:type="dxa" w:w="3439"/>
-            <w:shd w:fill="F9EAEA" w:val="clear"/>
+            <w:shd w:fill="FFEBEE" w:val="clear"/>
           </w:tcPr>
           <w:p>
             <w:r>
               <w:rPr>
                 <w:rFonts w:ascii="Arial" w:hAnsi="Arial" w:eastAsia="Arial"/>
                 <w:b w:val="0"/>
-                <w:color w:val="8C2020"/>
+                <w:color w:val="C62828"/>
                 <w:sz w:val="16"/>
               </w:rPr>
-              <w:t>Новые доступы, интеграции, сопровождение</w:t>
+              <w:t>Новые доступы и интеграции</w:t>
             </w:r>
           </w:p>
         </w:tc>
@@ -1925,24 +1059,24 @@
               <w:rPr>
                 <w:rFonts w:ascii="Arial" w:hAnsi="Arial" w:eastAsia="Arial"/>
                 <w:b/>
-                <w:color w:val="1A1A1A"/>
+                <w:color w:val="2B2B2B"/>
                 <w:sz w:val="16"/>
               </w:rPr>
-              <w:t>Где хранятся документы</w:t>
+              <w:t>Документы</w:t>
             </w:r>
           </w:p>
         </w:tc>
         <w:tc>
           <w:tcPr>
             <w:tcW w:type="dxa" w:w="3439"/>
-            <w:shd w:fill="EAF6EA" w:val="clear"/>
+            <w:shd w:fill="E8F5E9" w:val="clear"/>
           </w:tcPr>
           <w:p>
             <w:r>
               <w:rPr>
                 <w:rFonts w:ascii="Arial" w:hAnsi="Arial" w:eastAsia="Arial"/>
                 <w:b w:val="0"/>
-                <w:color w:val="1F6B2E"/>
+                <w:color w:val="2E7D32"/>
                 <w:sz w:val="16"/>
               </w:rPr>
               <w:t>В вашей базе 1С</w:t>
@@ -1952,17 +1086,17 @@
         <w:tc>
           <w:tcPr>
             <w:tcW w:type="dxa" w:w="3439"/>
-            <w:shd w:fill="F9EAEA" w:val="clear"/>
+            <w:shd w:fill="FFEBEE" w:val="clear"/>
           </w:tcPr>
           <w:p>
             <w:r>
               <w:rPr>
                 <w:rFonts w:ascii="Arial" w:hAnsi="Arial" w:eastAsia="Arial"/>
                 <w:b w:val="0"/>
-                <w:color w:val="8C2020"/>
+                <w:color w:val="C62828"/>
                 <w:sz w:val="16"/>
               </w:rPr>
-              <w:t>Облако оператора, часто за отдельную плату</w:t>
+              <w:t>Облако оператора, часто платно</w:t>
             </w:r>
           </w:p>
         </w:tc>
@@ -1977,44 +1111,44 @@
               <w:rPr>
                 <w:rFonts w:ascii="Arial" w:hAnsi="Arial" w:eastAsia="Arial"/>
                 <w:b/>
-                <w:color w:val="1A1A1A"/>
+                <w:color w:val="2B2B2B"/>
                 <w:sz w:val="16"/>
               </w:rPr>
-              <w:t>Оплата запуска</w:t>
+              <w:t>Оплата старта</w:t>
             </w:r>
           </w:p>
         </w:tc>
         <w:tc>
           <w:tcPr>
             <w:tcW w:type="dxa" w:w="3439"/>
-            <w:shd w:fill="EAF6EA" w:val="clear"/>
+            <w:shd w:fill="E8F5E9" w:val="clear"/>
           </w:tcPr>
           <w:p>
             <w:r>
               <w:rPr>
                 <w:rFonts w:ascii="Arial" w:hAnsi="Arial" w:eastAsia="Arial"/>
                 <w:b w:val="0"/>
-                <w:color w:val="1F6B2E"/>
+                <w:color w:val="2E7D32"/>
                 <w:sz w:val="16"/>
               </w:rPr>
-              <w:t>Часы поддержки — в подарок</w:t>
+              <w:t>Часы поддержки — подарок</w:t>
             </w:r>
           </w:p>
         </w:tc>
         <w:tc>
           <w:tcPr>
             <w:tcW w:type="dxa" w:w="3439"/>
-            <w:shd w:fill="F9EAEA" w:val="clear"/>
+            <w:shd w:fill="FFEBEE" w:val="clear"/>
           </w:tcPr>
           <w:p>
             <w:r>
               <w:rPr>
                 <w:rFonts w:ascii="Arial" w:hAnsi="Arial" w:eastAsia="Arial"/>
                 <w:b w:val="0"/>
-                <w:color w:val="8C2020"/>
+                <w:color w:val="C62828"/>
                 <w:sz w:val="16"/>
               </w:rPr>
-              <w:t>Внедрение обычно оплачивается отдельно</w:t>
+              <w:t>Внедрение обычно отдельной строкой</w:t>
             </w:r>
           </w:p>
         </w:tc>
@@ -2022,45 +1156,32 @@
     </w:tbl>
     <w:p>
       <w:pPr>
-        <w:spacing w:after="120" w:before="0"/>
+        <w:spacing w:after="160" w:before="0"/>
       </w:pPr>
       <w:r>
         <w:rPr>
           <w:rFonts w:ascii="Arial" w:hAnsi="Arial" w:eastAsia="Arial"/>
           <w:b w:val="0"/>
-          <w:color w:val="1A1A1A"/>
+          <w:color w:val="2B2B2B"/>
           <w:sz w:val="20"/>
         </w:rPr>
       </w:r>
     </w:p>
     <w:p>
       <w:pPr>
-        <w:spacing w:after="120" w:before="0"/>
-        <w:jc w:val="center"/>
+        <w:spacing w:after="40" w:before="0"/>
+        <w:pBdr>
+          <w:bottom w:val="single" w:sz="20" w:space="2" w:color="F0C14A"/>
+        </w:pBdr>
       </w:pPr>
       <w:r>
         <w:rPr>
           <w:rFonts w:ascii="Arial" w:hAnsi="Arial" w:eastAsia="Arial"/>
           <w:b/>
-          <w:color w:val="1A1A1A"/>
-          <w:sz w:val="22"/>
+          <w:color w:val="2B2B2B"/>
+          <w:sz w:val="26"/>
         </w:rPr>
-        <w:t>Готовы подключить 750 кабинетов и помочь с запуском</w:t>
-      </w:r>
-    </w:p>
-    <w:p>
-      <w:pPr>
-        <w:spacing w:after="120" w:before="0"/>
-        <w:jc w:val="center"/>
-      </w:pPr>
-      <w:r>
-        <w:rPr>
-          <w:rFonts w:ascii="Arial" w:hAnsi="Arial" w:eastAsia="Arial"/>
-          <w:b w:val="0"/>
-          <w:color w:val="5A5A5A"/>
-          <w:sz w:val="18"/>
-        </w:rPr>
-        <w:t>Проведём демонстрацию для кадровой службы и ИТ-отдела и ответим на вопросы.</w:t>
+        <w:t>Как проходит запуск</w:t>
       </w:r>
     </w:p>
     <w:tbl>
@@ -2068,12 +1189,300 @@
         <w:tblW w:type="auto" w:w="0"/>
         <w:tblLook w:firstColumn="1" w:firstRow="1" w:lastColumn="0" w:lastRow="0" w:noHBand="0" w:noVBand="1" w:val="04A0"/>
         <w:tblBorders>
-          <w:top w:val="single" w:sz="4" w:space="0" w:color="F0C14A"/>
-          <w:left w:val="single" w:sz="4" w:space="0" w:color="F0C14A"/>
-          <w:bottom w:val="single" w:sz="4" w:space="0" w:color="F0C14A"/>
-          <w:right w:val="single" w:sz="4" w:space="0" w:color="F0C14A"/>
-          <w:insideH w:val="single" w:sz="4" w:space="0" w:color="F0C14A"/>
-          <w:insideV w:val="single" w:sz="4" w:space="0" w:color="F0C14A"/>
+          <w:top w:val="single" w:sz="8" w:space="0" w:color="F0C14A"/>
+          <w:left w:val="single" w:sz="8" w:space="0" w:color="F0C14A"/>
+          <w:bottom w:val="single" w:sz="8" w:space="0" w:color="F0C14A"/>
+          <w:right w:val="single" w:sz="8" w:space="0" w:color="F0C14A"/>
+          <w:insideH w:val="single" w:sz="8" w:space="0" w:color="F0C14A"/>
+          <w:insideV w:val="single" w:sz="8" w:space="0" w:color="F0C14A"/>
+        </w:tblBorders>
+      </w:tblPr>
+      <w:tblGrid>
+        <w:gridCol w:w="2064"/>
+        <w:gridCol w:w="2064"/>
+        <w:gridCol w:w="2064"/>
+        <w:gridCol w:w="2064"/>
+        <w:gridCol w:w="2064"/>
+      </w:tblGrid>
+      <w:tr>
+        <w:tc>
+          <w:tcPr>
+            <w:tcW w:type="dxa" w:w="2064"/>
+            <w:shd w:fill="FFFBEA" w:val="clear"/>
+          </w:tcPr>
+          <w:p>
+            <w:pPr>
+              <w:jc w:val="center"/>
+            </w:pPr>
+            <w:r>
+              <w:rPr>
+                <w:rFonts w:ascii="Arial" w:hAnsi="Arial" w:eastAsia="Arial"/>
+                <w:b/>
+                <w:color w:val="9A7A10"/>
+                <w:sz w:val="24"/>
+              </w:rPr>
+              <w:t>1</w:t>
+            </w:r>
+          </w:p>
+          <w:p>
+            <w:pPr>
+              <w:jc w:val="center"/>
+            </w:pPr>
+            <w:r>
+              <w:rPr>
+                <w:rFonts w:ascii="Arial" w:hAnsi="Arial" w:eastAsia="Arial"/>
+                <w:b/>
+                <w:sz w:val="16"/>
+              </w:rPr>
+              <w:t>Договор и доступы</w:t>
+            </w:r>
+          </w:p>
+          <w:p>
+            <w:pPr>
+              <w:jc w:val="center"/>
+            </w:pPr>
+            <w:r>
+              <w:rPr>
+                <w:rFonts w:ascii="Arial" w:hAnsi="Arial" w:eastAsia="Arial"/>
+                <w:b w:val="0"/>
+                <w:color w:val="666666"/>
+                <w:sz w:val="16"/>
+              </w:rPr>
+              <w:t>2–4 дня</w:t>
+            </w:r>
+          </w:p>
+        </w:tc>
+        <w:tc>
+          <w:tcPr>
+            <w:tcW w:type="dxa" w:w="2064"/>
+            <w:shd w:fill="FFFBEA" w:val="clear"/>
+          </w:tcPr>
+          <w:p>
+            <w:pPr>
+              <w:jc w:val="center"/>
+            </w:pPr>
+            <w:r>
+              <w:rPr>
+                <w:rFonts w:ascii="Arial" w:hAnsi="Arial" w:eastAsia="Arial"/>
+                <w:b/>
+                <w:color w:val="9A7A10"/>
+                <w:sz w:val="24"/>
+              </w:rPr>
+              <w:t>2</w:t>
+            </w:r>
+          </w:p>
+          <w:p>
+            <w:pPr>
+              <w:jc w:val="center"/>
+            </w:pPr>
+            <w:r>
+              <w:rPr>
+                <w:rFonts w:ascii="Arial" w:hAnsi="Arial" w:eastAsia="Arial"/>
+                <w:b/>
+                <w:sz w:val="16"/>
+              </w:rPr>
+              <w:t>Настройка ≈4 часа</w:t>
+            </w:r>
+          </w:p>
+          <w:p>
+            <w:pPr>
+              <w:jc w:val="center"/>
+            </w:pPr>
+            <w:r>
+              <w:rPr>
+                <w:rFonts w:ascii="Arial" w:hAnsi="Arial" w:eastAsia="Arial"/>
+                <w:b w:val="0"/>
+                <w:color w:val="666666"/>
+                <w:sz w:val="16"/>
+              </w:rPr>
+              <w:t>1 день</w:t>
+            </w:r>
+          </w:p>
+        </w:tc>
+        <w:tc>
+          <w:tcPr>
+            <w:tcW w:type="dxa" w:w="2064"/>
+            <w:shd w:fill="FFFBEA" w:val="clear"/>
+          </w:tcPr>
+          <w:p>
+            <w:pPr>
+              <w:jc w:val="center"/>
+            </w:pPr>
+            <w:r>
+              <w:rPr>
+                <w:rFonts w:ascii="Arial" w:hAnsi="Arial" w:eastAsia="Arial"/>
+                <w:b/>
+                <w:color w:val="9A7A10"/>
+                <w:sz w:val="24"/>
+              </w:rPr>
+              <w:t>3</w:t>
+            </w:r>
+          </w:p>
+          <w:p>
+            <w:pPr>
+              <w:jc w:val="center"/>
+            </w:pPr>
+            <w:r>
+              <w:rPr>
+                <w:rFonts w:ascii="Arial" w:hAnsi="Arial" w:eastAsia="Arial"/>
+                <w:b/>
+                <w:sz w:val="16"/>
+              </w:rPr>
+              <w:t>Пилот на группе</w:t>
+            </w:r>
+          </w:p>
+          <w:p>
+            <w:pPr>
+              <w:jc w:val="center"/>
+            </w:pPr>
+            <w:r>
+              <w:rPr>
+                <w:rFonts w:ascii="Arial" w:hAnsi="Arial" w:eastAsia="Arial"/>
+                <w:b w:val="0"/>
+                <w:color w:val="666666"/>
+                <w:sz w:val="16"/>
+              </w:rPr>
+              <w:t>до 1 недели</w:t>
+            </w:r>
+          </w:p>
+        </w:tc>
+        <w:tc>
+          <w:tcPr>
+            <w:tcW w:type="dxa" w:w="2064"/>
+            <w:shd w:fill="FFFBEA" w:val="clear"/>
+          </w:tcPr>
+          <w:p>
+            <w:pPr>
+              <w:jc w:val="center"/>
+            </w:pPr>
+            <w:r>
+              <w:rPr>
+                <w:rFonts w:ascii="Arial" w:hAnsi="Arial" w:eastAsia="Arial"/>
+                <w:b/>
+                <w:color w:val="9A7A10"/>
+                <w:sz w:val="24"/>
+              </w:rPr>
+              <w:t>4</w:t>
+            </w:r>
+          </w:p>
+          <w:p>
+            <w:pPr>
+              <w:jc w:val="center"/>
+            </w:pPr>
+            <w:r>
+              <w:rPr>
+                <w:rFonts w:ascii="Arial" w:hAnsi="Arial" w:eastAsia="Arial"/>
+                <w:b/>
+                <w:sz w:val="16"/>
+              </w:rPr>
+              <w:t>Все 750 кабинетов</w:t>
+            </w:r>
+          </w:p>
+          <w:p>
+            <w:pPr>
+              <w:jc w:val="center"/>
+            </w:pPr>
+            <w:r>
+              <w:rPr>
+                <w:rFonts w:ascii="Arial" w:hAnsi="Arial" w:eastAsia="Arial"/>
+                <w:b w:val="0"/>
+                <w:color w:val="666666"/>
+                <w:sz w:val="16"/>
+              </w:rPr>
+              <w:t>2–3 недели</w:t>
+            </w:r>
+          </w:p>
+        </w:tc>
+        <w:tc>
+          <w:tcPr>
+            <w:tcW w:type="dxa" w:w="2064"/>
+            <w:shd w:fill="FFFBEA" w:val="clear"/>
+          </w:tcPr>
+          <w:p>
+            <w:pPr>
+              <w:jc w:val="center"/>
+            </w:pPr>
+            <w:r>
+              <w:rPr>
+                <w:rFonts w:ascii="Arial" w:hAnsi="Arial" w:eastAsia="Arial"/>
+                <w:b/>
+                <w:color w:val="9A7A10"/>
+                <w:sz w:val="24"/>
+              </w:rPr>
+              <w:t>5</w:t>
+            </w:r>
+          </w:p>
+          <w:p>
+            <w:pPr>
+              <w:jc w:val="center"/>
+            </w:pPr>
+            <w:r>
+              <w:rPr>
+                <w:rFonts w:ascii="Arial" w:hAnsi="Arial" w:eastAsia="Arial"/>
+                <w:b/>
+                <w:sz w:val="16"/>
+              </w:rPr>
+              <w:t>1 час в запасе</w:t>
+            </w:r>
+          </w:p>
+          <w:p>
+            <w:pPr>
+              <w:jc w:val="center"/>
+            </w:pPr>
+            <w:r>
+              <w:rPr>
+                <w:rFonts w:ascii="Arial" w:hAnsi="Arial" w:eastAsia="Arial"/>
+                <w:b w:val="0"/>
+                <w:color w:val="666666"/>
+                <w:sz w:val="16"/>
+              </w:rPr>
+              <w:t>по запросу</w:t>
+            </w:r>
+          </w:p>
+        </w:tc>
+      </w:tr>
+    </w:tbl>
+    <w:p>
+      <w:pPr>
+        <w:spacing w:after="160" w:before="0"/>
+      </w:pPr>
+      <w:r>
+        <w:rPr>
+          <w:rFonts w:ascii="Arial" w:hAnsi="Arial" w:eastAsia="Arial"/>
+          <w:b w:val="0"/>
+          <w:color w:val="2B2B2B"/>
+          <w:sz w:val="20"/>
+        </w:rPr>
+      </w:r>
+    </w:p>
+    <w:p>
+      <w:pPr>
+        <w:spacing w:after="40" w:before="0"/>
+        <w:pBdr>
+          <w:bottom w:val="single" w:sz="20" w:space="2" w:color="F0C14A"/>
+        </w:pBdr>
+      </w:pPr>
+      <w:r>
+        <w:rPr>
+          <w:rFonts w:ascii="Arial" w:hAnsi="Arial" w:eastAsia="Arial"/>
+          <w:b/>
+          <w:color w:val="2B2B2B"/>
+          <w:sz w:val="26"/>
+        </w:rPr>
+        <w:t>Ценообразование — одной таблицей</w:t>
+      </w:r>
+    </w:p>
+    <w:tbl>
+      <w:tblPr>
+        <w:tblW w:type="auto" w:w="0"/>
+        <w:tblLook w:firstColumn="1" w:firstRow="1" w:lastColumn="0" w:lastRow="0" w:noHBand="0" w:noVBand="1" w:val="04A0"/>
+        <w:tblBorders>
+          <w:top w:val="single" w:sz="8" w:space="0" w:color="F0C14A"/>
+          <w:left w:val="single" w:sz="8" w:space="0" w:color="F0C14A"/>
+          <w:bottom w:val="single" w:sz="8" w:space="0" w:color="F0C14A"/>
+          <w:right w:val="single" w:sz="8" w:space="0" w:color="F0C14A"/>
+          <w:insideH w:val="single" w:sz="8" w:space="0" w:color="F0C14A"/>
+          <w:insideV w:val="single" w:sz="8" w:space="0" w:color="F0C14A"/>
         </w:tblBorders>
       </w:tblPr>
       <w:tblGrid>
@@ -2084,14 +1493,443 @@
         <w:tc>
           <w:tcPr>
             <w:tcW w:type="dxa" w:w="5159"/>
-            <w:shd w:fill="FFF8E8" w:val="clear"/>
+            <w:shd w:fill="F0C14A" w:val="clear"/>
+          </w:tcPr>
+          <w:p>
+            <w:r>
+              <w:rPr>
+                <w:rFonts w:ascii="Arial" w:hAnsi="Arial" w:eastAsia="Arial"/>
+                <w:b/>
+                <w:sz w:val="18"/>
+              </w:rPr>
+              <w:t>Статья</w:t>
+            </w:r>
+          </w:p>
+        </w:tc>
+        <w:tc>
+          <w:tcPr>
+            <w:tcW w:type="dxa" w:w="5159"/>
+            <w:shd w:fill="F0C14A" w:val="clear"/>
+          </w:tcPr>
+          <w:p>
+            <w:r>
+              <w:rPr>
+                <w:rFonts w:ascii="Arial" w:hAnsi="Arial" w:eastAsia="Arial"/>
+                <w:b/>
+                <w:sz w:val="18"/>
+              </w:rPr>
+              <w:t>Сумма</w:t>
+            </w:r>
+          </w:p>
+        </w:tc>
+      </w:tr>
+      <w:tr>
+        <w:tc>
+          <w:tcPr>
+            <w:tcW w:type="dxa" w:w="5159"/>
+            <w:shd w:fill="FFFBEA" w:val="clear"/>
           </w:tcPr>
           <w:p>
             <w:r>
               <w:rPr>
                 <w:rFonts w:ascii="Arial" w:hAnsi="Arial" w:eastAsia="Arial"/>
                 <w:b w:val="0"/>
-                <w:color w:val="5A5A5A"/>
+                <w:sz w:val="18"/>
+              </w:rPr>
+              <w:t>750 личных кабинетов на 12 месяцев (пакеты 500+200+50)</w:t>
+            </w:r>
+          </w:p>
+        </w:tc>
+        <w:tc>
+          <w:tcPr>
+            <w:tcW w:type="dxa" w:w="5159"/>
+            <w:shd w:fill="FFFBEA" w:val="clear"/>
+          </w:tcPr>
+          <w:p>
+            <w:pPr>
+              <w:jc w:val="right"/>
+            </w:pPr>
+            <w:r>
+              <w:rPr>
+                <w:rFonts w:ascii="Arial" w:hAnsi="Arial" w:eastAsia="Arial"/>
+                <w:b/>
+                <w:color w:val="2B2B2B"/>
+                <w:sz w:val="20"/>
+              </w:rPr>
+              <w:t>223 200 ₽</w:t>
+            </w:r>
+          </w:p>
+        </w:tc>
+      </w:tr>
+      <w:tr>
+        <w:tc>
+          <w:tcPr>
+            <w:tcW w:type="dxa" w:w="5159"/>
+            <w:shd w:fill="FFF6D8" w:val="clear"/>
+          </w:tcPr>
+          <w:p>
+            <w:r>
+              <w:rPr>
+                <w:rFonts w:ascii="Arial" w:hAnsi="Arial" w:eastAsia="Arial"/>
+                <w:b w:val="0"/>
+                <w:sz w:val="18"/>
+              </w:rPr>
+              <w:t>Настройка и запуск сервиса (≈4 часа поддержки)</w:t>
+            </w:r>
+          </w:p>
+        </w:tc>
+        <w:tc>
+          <w:tcPr>
+            <w:tcW w:type="dxa" w:w="5159"/>
+            <w:shd w:fill="FFF6D8" w:val="clear"/>
+          </w:tcPr>
+          <w:p>
+            <w:pPr>
+              <w:jc w:val="right"/>
+            </w:pPr>
+            <w:r>
+              <w:rPr>
+                <w:rFonts w:ascii="Arial" w:hAnsi="Arial" w:eastAsia="Arial"/>
+                <w:b/>
+                <w:color w:val="2E7D32"/>
+                <w:sz w:val="20"/>
+              </w:rPr>
+              <w:t>0 ₽ — из подарка</w:t>
+            </w:r>
+          </w:p>
+        </w:tc>
+      </w:tr>
+      <w:tr>
+        <w:tc>
+          <w:tcPr>
+            <w:tcW w:type="dxa" w:w="5159"/>
+            <w:shd w:fill="FFF6D8" w:val="clear"/>
+          </w:tcPr>
+          <w:p>
+            <w:r>
+              <w:rPr>
+                <w:rFonts w:ascii="Arial" w:hAnsi="Arial" w:eastAsia="Arial"/>
+                <w:b w:val="0"/>
+                <w:sz w:val="18"/>
+              </w:rPr>
+              <w:t>Запас на вопросы по 1С после запуска (1 час)</w:t>
+            </w:r>
+          </w:p>
+        </w:tc>
+        <w:tc>
+          <w:tcPr>
+            <w:tcW w:type="dxa" w:w="5159"/>
+            <w:shd w:fill="FFF6D8" w:val="clear"/>
+          </w:tcPr>
+          <w:p>
+            <w:pPr>
+              <w:jc w:val="right"/>
+            </w:pPr>
+            <w:r>
+              <w:rPr>
+                <w:rFonts w:ascii="Arial" w:hAnsi="Arial" w:eastAsia="Arial"/>
+                <w:b/>
+                <w:color w:val="2E7D32"/>
+                <w:sz w:val="20"/>
+              </w:rPr>
+              <w:t>0 ₽ — из подарка</w:t>
+            </w:r>
+          </w:p>
+        </w:tc>
+      </w:tr>
+      <w:tr>
+        <w:tc>
+          <w:tcPr>
+            <w:tcW w:type="dxa" w:w="5159"/>
+            <w:shd w:fill="FFF6D8" w:val="clear"/>
+          </w:tcPr>
+          <w:p>
+            <w:r>
+              <w:rPr>
+                <w:rFonts w:ascii="Arial" w:hAnsi="Arial" w:eastAsia="Arial"/>
+                <w:b w:val="0"/>
+                <w:sz w:val="18"/>
+              </w:rPr>
+              <w:t>Подарок по акции — 5 часов линии консультаций</w:t>
+            </w:r>
+          </w:p>
+        </w:tc>
+        <w:tc>
+          <w:tcPr>
+            <w:tcW w:type="dxa" w:w="5159"/>
+            <w:shd w:fill="FFF6D8" w:val="clear"/>
+          </w:tcPr>
+          <w:p>
+            <w:pPr>
+              <w:jc w:val="right"/>
+            </w:pPr>
+            <w:r>
+              <w:rPr>
+                <w:rFonts w:ascii="Arial" w:hAnsi="Arial" w:eastAsia="Arial"/>
+                <w:b/>
+                <w:color w:val="2E7D32"/>
+                <w:sz w:val="20"/>
+              </w:rPr>
+              <w:t>выгода 18 300 ₽</w:t>
+            </w:r>
+          </w:p>
+        </w:tc>
+      </w:tr>
+    </w:tbl>
+    <w:tbl>
+      <w:tblPr>
+        <w:tblW w:type="auto" w:w="0"/>
+        <w:tblLook w:firstColumn="1" w:firstRow="1" w:lastColumn="0" w:lastRow="0" w:noHBand="0" w:noVBand="1" w:val="04A0"/>
+        <w:tblBorders>
+          <w:top w:val="single" w:sz="14" w:space="0" w:color="F0C14A"/>
+          <w:left w:val="single" w:sz="14" w:space="0" w:color="F0C14A"/>
+          <w:bottom w:val="single" w:sz="14" w:space="0" w:color="F0C14A"/>
+          <w:right w:val="single" w:sz="14" w:space="0" w:color="F0C14A"/>
+          <w:insideH w:val="single" w:sz="14" w:space="0" w:color="F0C14A"/>
+          <w:insideV w:val="single" w:sz="14" w:space="0" w:color="F0C14A"/>
+        </w:tblBorders>
+      </w:tblPr>
+      <w:tblGrid>
+        <w:gridCol w:w="5159"/>
+        <w:gridCol w:w="5159"/>
+      </w:tblGrid>
+      <w:tr>
+        <w:tc>
+          <w:tcPr>
+            <w:tcW w:type="dxa" w:w="5159"/>
+            <w:shd w:fill="F0C14A" w:val="clear"/>
+          </w:tcPr>
+          <w:p>
+            <w:r>
+              <w:rPr>
+                <w:rFonts w:ascii="Arial" w:hAnsi="Arial" w:eastAsia="Arial"/>
+                <w:b/>
+                <w:sz w:val="24"/>
+              </w:rPr>
+              <w:t>Итого к оплате</w:t>
+            </w:r>
+          </w:p>
+          <w:p>
+            <w:r>
+              <w:rPr>
+                <w:rFonts w:ascii="Arial" w:hAnsi="Arial" w:eastAsia="Arial"/>
+                <w:b w:val="0"/>
+                <w:sz w:val="16"/>
+              </w:rPr>
+              <w:t>Только пакет кабинетов. Настройка и стартовая поддержка — бесплатно.</w:t>
+            </w:r>
+          </w:p>
+        </w:tc>
+        <w:tc>
+          <w:tcPr>
+            <w:tcW w:type="dxa" w:w="5159"/>
+            <w:shd w:fill="F0C14A" w:val="clear"/>
+          </w:tcPr>
+          <w:p>
+            <w:pPr>
+              <w:jc w:val="right"/>
+            </w:pPr>
+            <w:r>
+              <w:rPr>
+                <w:rFonts w:ascii="Arial" w:hAnsi="Arial" w:eastAsia="Arial"/>
+                <w:b/>
+                <w:sz w:val="36"/>
+              </w:rPr>
+              <w:t>223 200 ₽</w:t>
+            </w:r>
+          </w:p>
+        </w:tc>
+      </w:tr>
+    </w:tbl>
+    <w:p>
+      <w:pPr>
+        <w:spacing w:after="160" w:before="0"/>
+      </w:pPr>
+      <w:r>
+        <w:rPr>
+          <w:rFonts w:ascii="Arial" w:hAnsi="Arial" w:eastAsia="Arial"/>
+          <w:b w:val="0"/>
+          <w:color w:val="2B2B2B"/>
+          <w:sz w:val="20"/>
+        </w:rPr>
+      </w:r>
+    </w:p>
+    <w:p>
+      <w:pPr>
+        <w:spacing w:after="40" w:before="0"/>
+        <w:pBdr>
+          <w:bottom w:val="single" w:sz="20" w:space="2" w:color="F0C14A"/>
+        </w:pBdr>
+      </w:pPr>
+      <w:r>
+        <w:rPr>
+          <w:rFonts w:ascii="Arial" w:hAnsi="Arial" w:eastAsia="Arial"/>
+          <w:b/>
+          <w:color w:val="2B2B2B"/>
+          <w:sz w:val="26"/>
+        </w:rPr>
+        <w:t>Важно знать</w:t>
+      </w:r>
+    </w:p>
+    <w:tbl>
+      <w:tblPr>
+        <w:tblW w:type="auto" w:w="0"/>
+        <w:tblLook w:firstColumn="1" w:firstRow="1" w:lastColumn="0" w:lastRow="0" w:noHBand="0" w:noVBand="1" w:val="04A0"/>
+        <w:tblBorders>
+          <w:top w:val="single" w:sz="8" w:space="0" w:color="F0C14A"/>
+          <w:left w:val="single" w:sz="8" w:space="0" w:color="F0C14A"/>
+          <w:bottom w:val="single" w:sz="8" w:space="0" w:color="F0C14A"/>
+          <w:right w:val="single" w:sz="8" w:space="0" w:color="F0C14A"/>
+          <w:insideH w:val="single" w:sz="8" w:space="0" w:color="F0C14A"/>
+          <w:insideV w:val="single" w:sz="8" w:space="0" w:color="F0C14A"/>
+        </w:tblBorders>
+      </w:tblPr>
+      <w:tblGrid>
+        <w:gridCol w:w="5159"/>
+        <w:gridCol w:w="5159"/>
+      </w:tblGrid>
+      <w:tr>
+        <w:tc>
+          <w:tcPr>
+            <w:tcW w:type="dxa" w:w="5159"/>
+            <w:shd w:fill="FFFBEA" w:val="clear"/>
+          </w:tcPr>
+          <w:p>
+            <w:r>
+              <w:rPr>
+                <w:rFonts w:ascii="Arial" w:hAnsi="Arial" w:eastAsia="Arial"/>
+                <w:b/>
+                <w:sz w:val="20"/>
+              </w:rPr>
+              <w:t>Подпись бесплатно</w:t>
+            </w:r>
+          </w:p>
+          <w:p>
+            <w:r>
+              <w:rPr>
+                <w:rFonts w:ascii="Arial" w:hAnsi="Arial" w:eastAsia="Arial"/>
+                <w:b w:val="0"/>
+                <w:color w:val="666666"/>
+                <w:sz w:val="18"/>
+              </w:rPr>
+              <w:t>Электронная подпись сотрудникам выпускается бесплатно.</w:t>
+            </w:r>
+          </w:p>
+        </w:tc>
+        <w:tc>
+          <w:tcPr>
+            <w:tcW w:type="dxa" w:w="5159"/>
+            <w:shd w:fill="FFFBEA" w:val="clear"/>
+          </w:tcPr>
+          <w:p>
+            <w:r>
+              <w:rPr>
+                <w:rFonts w:ascii="Arial" w:hAnsi="Arial" w:eastAsia="Arial"/>
+                <w:b/>
+                <w:sz w:val="20"/>
+              </w:rPr>
+              <w:t>Шаблоны документов</w:t>
+            </w:r>
+          </w:p>
+          <w:p>
+            <w:r>
+              <w:rPr>
+                <w:rFonts w:ascii="Arial" w:hAnsi="Arial" w:eastAsia="Arial"/>
+                <w:b w:val="0"/>
+                <w:color w:val="666666"/>
+                <w:sz w:val="18"/>
+              </w:rPr>
+              <w:t>Положение, уведомления и согласия для перехода — в комплекте.</w:t>
+            </w:r>
+          </w:p>
+        </w:tc>
+      </w:tr>
+      <w:tr>
+        <w:tc>
+          <w:tcPr>
+            <w:tcW w:type="dxa" w:w="5159"/>
+            <w:shd w:fill="FFFBEA" w:val="clear"/>
+          </w:tcPr>
+          <w:p>
+            <w:r>
+              <w:rPr>
+                <w:rFonts w:ascii="Arial" w:hAnsi="Arial" w:eastAsia="Arial"/>
+                <w:b/>
+                <w:sz w:val="20"/>
+              </w:rPr>
+              <w:t>Формат работ</w:t>
+            </w:r>
+          </w:p>
+          <w:p>
+            <w:r>
+              <w:rPr>
+                <w:rFonts w:ascii="Arial" w:hAnsi="Arial" w:eastAsia="Arial"/>
+                <w:b w:val="0"/>
+                <w:color w:val="666666"/>
+                <w:sz w:val="18"/>
+              </w:rPr>
+              <w:t>Удалённо. Выезд и нетиповые доработки — отдельно.</w:t>
+            </w:r>
+          </w:p>
+        </w:tc>
+        <w:tc>
+          <w:tcPr>
+            <w:tcW w:type="dxa" w:w="5159"/>
+            <w:shd w:fill="FFFBEA" w:val="clear"/>
+          </w:tcPr>
+          <w:p>
+            <w:r>
+              <w:rPr>
+                <w:rFonts w:ascii="Arial" w:hAnsi="Arial" w:eastAsia="Arial"/>
+                <w:b/>
+                <w:sz w:val="20"/>
+              </w:rPr>
+              <w:t>Срок предложения</w:t>
+            </w:r>
+          </w:p>
+          <w:p>
+            <w:r>
+              <w:rPr>
+                <w:rFonts w:ascii="Arial" w:hAnsi="Arial" w:eastAsia="Arial"/>
+                <w:b w:val="0"/>
+                <w:color w:val="666666"/>
+                <w:sz w:val="18"/>
+              </w:rPr>
+              <w:t>Действует 30 дней с даты отправки.</w:t>
+            </w:r>
+          </w:p>
+        </w:tc>
+      </w:tr>
+    </w:tbl>
+    <w:tbl>
+      <w:tblPr>
+        <w:tblW w:type="auto" w:w="0"/>
+        <w:tblLook w:firstColumn="1" w:firstRow="1" w:lastColumn="0" w:lastRow="0" w:noHBand="0" w:noVBand="1" w:val="04A0"/>
+        <w:tblBorders>
+          <w:top w:val="single" w:sz="12" w:space="0" w:color="F0C14A"/>
+          <w:left w:val="single" w:sz="12" w:space="0" w:color="F0C14A"/>
+          <w:bottom w:val="single" w:sz="12" w:space="0" w:color="F0C14A"/>
+          <w:right w:val="single" w:sz="12" w:space="0" w:color="F0C14A"/>
+          <w:insideH w:val="single" w:sz="12" w:space="0" w:color="F0C14A"/>
+          <w:insideV w:val="single" w:sz="12" w:space="0" w:color="F0C14A"/>
+        </w:tblBorders>
+      </w:tblPr>
+      <w:tblGrid>
+        <w:gridCol w:w="5159"/>
+        <w:gridCol w:w="5159"/>
+      </w:tblGrid>
+      <w:tr>
+        <w:tc>
+          <w:tcPr>
+            <w:tcW w:type="dxa" w:w="5159"/>
+            <w:shd w:fill="FFF6D8" w:val="clear"/>
+          </w:tcPr>
+          <w:p>
+            <w:r>
+              <w:rPr>
+                <w:rFonts w:ascii="Arial" w:hAnsi="Arial" w:eastAsia="Arial"/>
+                <w:b w:val="0"/>
+                <w:color w:val="666666"/>
                 <w:sz w:val="16"/>
               </w:rPr>
               <w:t>Ваш менеджер</w:t>
@@ -2102,7 +1940,7 @@
               <w:rPr>
                 <w:rFonts w:ascii="Arial" w:hAnsi="Arial" w:eastAsia="Arial"/>
                 <w:b/>
-                <w:sz w:val="24"/>
+                <w:sz w:val="26"/>
               </w:rPr>
               <w:t>Данил Кургузов</w:t>
             </w:r>
@@ -2131,7 +1969,7 @@
         <w:tc>
           <w:tcPr>
             <w:tcW w:type="dxa" w:w="5159"/>
-            <w:shd w:fill="FFF8E8" w:val="clear"/>
+            <w:shd w:fill="FFF6D8" w:val="clear"/>
           </w:tcPr>
           <w:p>
             <w:r>
@@ -2148,10 +1986,10 @@
               <w:rPr>
                 <w:rFonts w:ascii="Arial" w:hAnsi="Arial" w:eastAsia="Arial"/>
                 <w:b w:val="0"/>
-                <w:color w:val="5A5A5A"/>
+                <w:color w:val="666666"/>
                 <w:sz w:val="18"/>
               </w:rPr>
-              <w:t>www.forus.ru</w:t>
+              <w:t>Готовы подключить и показать на демо</w:t>
             </w:r>
           </w:p>
           <w:p>
@@ -2159,10 +1997,21 @@
               <w:rPr>
                 <w:rFonts w:ascii="Arial" w:hAnsi="Arial" w:eastAsia="Arial"/>
                 <w:b w:val="0"/>
-                <w:color w:val="5A5A5A"/>
+                <w:color w:val="666666"/>
                 <w:sz w:val="18"/>
               </w:rPr>
-              <w:t>г. Иркутск, ул. Ямская, 1/1</w:t>
+              <w:t>для кадровой службы и ИТ-отдела</w:t>
+            </w:r>
+          </w:p>
+          <w:p>
+            <w:r>
+              <w:rPr>
+                <w:rFonts w:ascii="Arial" w:hAnsi="Arial" w:eastAsia="Arial"/>
+                <w:b w:val="0"/>
+                <w:color w:val="666666"/>
+                <w:sz w:val="18"/>
+              </w:rPr>
+              <w:t>www.forus.ru</w:t>
             </w:r>
           </w:p>
         </w:tc>

</xml_diff>